<commit_message>
Try out jinja filters
</commit_message>
<xml_diff>
--- a/events/document_templates/participant_list.docx
+++ b/events/document_templates/participant_list.docx
@@ -10,11 +10,19 @@
           <w:rFonts w:ascii="Arial" w:hAnsi="Arial" w:cs="Arial"/>
         </w:rPr>
       </w:pPr>
-      <w:r>
-        <w:rPr>
-          <w:rFonts w:ascii="Arial" w:hAnsi="Arial" w:cs="Arial"/>
-        </w:rPr>
-        <w:t>Participant List</w:t>
+      <w:proofErr w:type="spellStart"/>
+      <w:r>
+        <w:rPr>
+          <w:rFonts w:ascii="Arial" w:hAnsi="Arial" w:cs="Arial"/>
+        </w:rPr>
+        <w:t>Participant</w:t>
+      </w:r>
+      <w:proofErr w:type="spellEnd"/>
+      <w:r>
+        <w:rPr>
+          <w:rFonts w:ascii="Arial" w:hAnsi="Arial" w:cs="Arial"/>
+        </w:rPr>
+        <w:t xml:space="preserve"> List</w:t>
       </w:r>
     </w:p>
     <w:p>
@@ -71,11 +79,19 @@
                 <w:rFonts w:ascii="Arial" w:hAnsi="Arial" w:cs="Arial"/>
               </w:rPr>
             </w:pPr>
+            <w:proofErr w:type="gramStart"/>
             <w:r>
               <w:rPr>
                 <w:rFonts w:ascii="Arial" w:hAnsi="Arial" w:cs="Arial"/>
               </w:rPr>
-              <w:t>{{ event.id }}</w:t>
+              <w:t>{{ event.id</w:t>
+            </w:r>
+            <w:proofErr w:type="gramEnd"/>
+            <w:r>
+              <w:rPr>
+                <w:rFonts w:ascii="Arial" w:hAnsi="Arial" w:cs="Arial"/>
+              </w:rPr>
+              <w:t xml:space="preserve"> }}</w:t>
             </w:r>
           </w:p>
         </w:tc>
@@ -109,11 +125,87 @@
                 <w:rFonts w:ascii="Arial" w:hAnsi="Arial" w:cs="Arial"/>
               </w:rPr>
             </w:pPr>
+            <w:proofErr w:type="gramStart"/>
             <w:r>
               <w:rPr>
                 <w:rFonts w:ascii="Arial" w:hAnsi="Arial" w:cs="Arial"/>
               </w:rPr>
-              <w:t>{{ event.title }}</w:t>
+              <w:t xml:space="preserve">{{ </w:t>
+            </w:r>
+            <w:proofErr w:type="spellStart"/>
+            <w:r>
+              <w:rPr>
+                <w:rFonts w:ascii="Arial" w:hAnsi="Arial" w:cs="Arial"/>
+              </w:rPr>
+              <w:t>event</w:t>
+            </w:r>
+            <w:proofErr w:type="gramEnd"/>
+            <w:r>
+              <w:rPr>
+                <w:rFonts w:ascii="Arial" w:hAnsi="Arial" w:cs="Arial"/>
+              </w:rPr>
+              <w:t>.</w:t>
+            </w:r>
+            <w:proofErr w:type="gramStart"/>
+            <w:r>
+              <w:rPr>
+                <w:rFonts w:ascii="Arial" w:hAnsi="Arial" w:cs="Arial"/>
+              </w:rPr>
+              <w:t>title</w:t>
+            </w:r>
+            <w:proofErr w:type="spellEnd"/>
+            <w:r>
+              <w:rPr>
+                <w:rFonts w:ascii="Arial" w:hAnsi="Arial" w:cs="Arial"/>
+              </w:rPr>
+              <w:t xml:space="preserve"> }</w:t>
+            </w:r>
+            <w:proofErr w:type="gramEnd"/>
+            <w:r>
+              <w:rPr>
+                <w:rFonts w:ascii="Arial" w:hAnsi="Arial" w:cs="Arial"/>
+              </w:rPr>
+              <w:t>}</w:t>
+            </w:r>
+            <w:r>
+              <w:rPr>
+                <w:rFonts w:ascii="Arial" w:hAnsi="Arial" w:cs="Arial"/>
+              </w:rPr>
+              <w:t xml:space="preserve"> (</w:t>
+            </w:r>
+            <w:proofErr w:type="gramStart"/>
+            <w:r>
+              <w:rPr>
+                <w:rFonts w:ascii="Arial" w:hAnsi="Arial" w:cs="Arial"/>
+              </w:rPr>
+              <w:t xml:space="preserve">{{ </w:t>
+            </w:r>
+            <w:proofErr w:type="spellStart"/>
+            <w:r>
+              <w:rPr>
+                <w:rFonts w:ascii="Arial" w:hAnsi="Arial" w:cs="Arial"/>
+              </w:rPr>
+              <w:t>event</w:t>
+            </w:r>
+            <w:proofErr w:type="gramEnd"/>
+            <w:r>
+              <w:rPr>
+                <w:rFonts w:ascii="Arial" w:hAnsi="Arial" w:cs="Arial"/>
+              </w:rPr>
+              <w:t>.title|initials</w:t>
+            </w:r>
+            <w:proofErr w:type="spellEnd"/>
+            <w:r>
+              <w:rPr>
+                <w:rFonts w:ascii="Arial" w:hAnsi="Arial" w:cs="Arial"/>
+              </w:rPr>
+              <w:t xml:space="preserve"> }}</w:t>
+            </w:r>
+            <w:r>
+              <w:rPr>
+                <w:rFonts w:ascii="Arial" w:hAnsi="Arial" w:cs="Arial"/>
+              </w:rPr>
+              <w:t>)</w:t>
             </w:r>
           </w:p>
         </w:tc>
@@ -147,11 +239,47 @@
                 <w:rFonts w:ascii="Arial" w:hAnsi="Arial" w:cs="Arial"/>
               </w:rPr>
             </w:pPr>
+            <w:proofErr w:type="gramStart"/>
             <w:r>
               <w:rPr>
                 <w:rFonts w:ascii="Arial" w:hAnsi="Arial" w:cs="Arial"/>
               </w:rPr>
-              <w:t>{{ event.start_at }}</w:t>
+              <w:t xml:space="preserve">{{ </w:t>
+            </w:r>
+            <w:proofErr w:type="spellStart"/>
+            <w:r>
+              <w:rPr>
+                <w:rFonts w:ascii="Arial" w:hAnsi="Arial" w:cs="Arial"/>
+              </w:rPr>
+              <w:t>event</w:t>
+            </w:r>
+            <w:proofErr w:type="gramEnd"/>
+            <w:r>
+              <w:rPr>
+                <w:rFonts w:ascii="Arial" w:hAnsi="Arial" w:cs="Arial"/>
+              </w:rPr>
+              <w:t>.start_at|django_</w:t>
+            </w:r>
+            <w:proofErr w:type="gramStart"/>
+            <w:r>
+              <w:rPr>
+                <w:rFonts w:ascii="Arial" w:hAnsi="Arial" w:cs="Arial"/>
+              </w:rPr>
+              <w:t>date</w:t>
+            </w:r>
+            <w:proofErr w:type="spellEnd"/>
+            <w:r>
+              <w:rPr>
+                <w:rFonts w:ascii="Arial" w:hAnsi="Arial" w:cs="Arial"/>
+              </w:rPr>
+              <w:t>(</w:t>
+            </w:r>
+            <w:proofErr w:type="gramEnd"/>
+            <w:r>
+              <w:rPr>
+                <w:rFonts w:ascii="Arial" w:hAnsi="Arial" w:cs="Arial"/>
+              </w:rPr>
+              <w:t>"D d M Y") }}</w:t>
             </w:r>
           </w:p>
         </w:tc>
@@ -185,11 +313,33 @@
                 <w:rFonts w:ascii="Arial" w:hAnsi="Arial" w:cs="Arial"/>
               </w:rPr>
             </w:pPr>
+            <w:proofErr w:type="gramStart"/>
             <w:r>
               <w:rPr>
                 <w:rFonts w:ascii="Arial" w:hAnsi="Arial" w:cs="Arial"/>
               </w:rPr>
-              <w:t>{{ event.end_at }}</w:t>
+              <w:t xml:space="preserve">{{ </w:t>
+            </w:r>
+            <w:proofErr w:type="spellStart"/>
+            <w:r>
+              <w:rPr>
+                <w:rFonts w:ascii="Arial" w:hAnsi="Arial" w:cs="Arial"/>
+              </w:rPr>
+              <w:t>event.end</w:t>
+            </w:r>
+            <w:proofErr w:type="gramEnd"/>
+            <w:r>
+              <w:rPr>
+                <w:rFonts w:ascii="Arial" w:hAnsi="Arial" w:cs="Arial"/>
+              </w:rPr>
+              <w:t>_at</w:t>
+            </w:r>
+            <w:proofErr w:type="spellEnd"/>
+            <w:r>
+              <w:rPr>
+                <w:rFonts w:ascii="Arial" w:hAnsi="Arial" w:cs="Arial"/>
+              </w:rPr>
+              <w:t xml:space="preserve"> }}</w:t>
             </w:r>
           </w:p>
         </w:tc>
@@ -205,12 +355,28 @@
                 <w:rFonts w:ascii="Arial" w:hAnsi="Arial" w:cs="Arial"/>
               </w:rPr>
             </w:pPr>
+            <w:proofErr w:type="spellStart"/>
             <w:r>
               <w:rPr>
                 <w:rFonts w:ascii="Arial" w:hAnsi="Arial" w:cs="Arial"/>
               </w:rPr>
-              <w:t>Responsible person</w:t>
+              <w:t>Responsible</w:t>
             </w:r>
+            <w:proofErr w:type="spellEnd"/>
+            <w:r>
+              <w:rPr>
+                <w:rFonts w:ascii="Arial" w:hAnsi="Arial" w:cs="Arial"/>
+              </w:rPr>
+              <w:t xml:space="preserve"> </w:t>
+            </w:r>
+            <w:proofErr w:type="spellStart"/>
+            <w:r>
+              <w:rPr>
+                <w:rFonts w:ascii="Arial" w:hAnsi="Arial" w:cs="Arial"/>
+              </w:rPr>
+              <w:t>person</w:t>
+            </w:r>
+            <w:proofErr w:type="spellEnd"/>
           </w:p>
         </w:tc>
         <w:tc>
@@ -223,11 +389,33 @@
                 <w:rFonts w:ascii="Arial" w:hAnsi="Arial" w:cs="Arial"/>
               </w:rPr>
             </w:pPr>
+            <w:proofErr w:type="gramStart"/>
             <w:r>
               <w:rPr>
                 <w:rFonts w:ascii="Arial" w:hAnsi="Arial" w:cs="Arial"/>
               </w:rPr>
-              <w:t>{{ event.responsible_person }}</w:t>
+              <w:t xml:space="preserve">{{ </w:t>
+            </w:r>
+            <w:proofErr w:type="spellStart"/>
+            <w:r>
+              <w:rPr>
+                <w:rFonts w:ascii="Arial" w:hAnsi="Arial" w:cs="Arial"/>
+              </w:rPr>
+              <w:t>event</w:t>
+            </w:r>
+            <w:proofErr w:type="gramEnd"/>
+            <w:r>
+              <w:rPr>
+                <w:rFonts w:ascii="Arial" w:hAnsi="Arial" w:cs="Arial"/>
+              </w:rPr>
+              <w:t>.responsible_person</w:t>
+            </w:r>
+            <w:proofErr w:type="spellEnd"/>
+            <w:r>
+              <w:rPr>
+                <w:rFonts w:ascii="Arial" w:hAnsi="Arial" w:cs="Arial"/>
+              </w:rPr>
+              <w:t xml:space="preserve"> }}</w:t>
             </w:r>
           </w:p>
         </w:tc>
@@ -277,8 +465,19 @@
                 <w:sz w:val="22"/>
                 <w:szCs w:val="22"/>
               </w:rPr>
-              <w:t>First name</w:t>
+              <w:t xml:space="preserve">First </w:t>
             </w:r>
+            <w:proofErr w:type="spellStart"/>
+            <w:r>
+              <w:rPr>
+                <w:rFonts w:ascii="Arial" w:hAnsi="Arial" w:cs="Arial"/>
+                <w:b/>
+                <w:sz w:val="22"/>
+                <w:szCs w:val="22"/>
+              </w:rPr>
+              <w:t>name</w:t>
+            </w:r>
+            <w:proofErr w:type="spellEnd"/>
           </w:p>
         </w:tc>
         <w:tc>
@@ -373,7 +572,63 @@
               <w:rPr>
                 <w:rFonts w:ascii="Arial" w:hAnsi="Arial" w:cs="Arial"/>
               </w:rPr>
-              <w:t>{%tr for participant in participants %}</w:t>
+              <w:t>{%</w:t>
+            </w:r>
+            <w:proofErr w:type="spellStart"/>
+            <w:r>
+              <w:rPr>
+                <w:rFonts w:ascii="Arial" w:hAnsi="Arial" w:cs="Arial"/>
+              </w:rPr>
+              <w:t>tr</w:t>
+            </w:r>
+            <w:proofErr w:type="spellEnd"/>
+            <w:r>
+              <w:rPr>
+                <w:rFonts w:ascii="Arial" w:hAnsi="Arial" w:cs="Arial"/>
+              </w:rPr>
+              <w:t xml:space="preserve"> </w:t>
+            </w:r>
+            <w:proofErr w:type="spellStart"/>
+            <w:r>
+              <w:rPr>
+                <w:rFonts w:ascii="Arial" w:hAnsi="Arial" w:cs="Arial"/>
+              </w:rPr>
+              <w:t>for</w:t>
+            </w:r>
+            <w:proofErr w:type="spellEnd"/>
+            <w:r>
+              <w:rPr>
+                <w:rFonts w:ascii="Arial" w:hAnsi="Arial" w:cs="Arial"/>
+              </w:rPr>
+              <w:t xml:space="preserve"> </w:t>
+            </w:r>
+            <w:proofErr w:type="spellStart"/>
+            <w:r>
+              <w:rPr>
+                <w:rFonts w:ascii="Arial" w:hAnsi="Arial" w:cs="Arial"/>
+              </w:rPr>
+              <w:t>participant</w:t>
+            </w:r>
+            <w:proofErr w:type="spellEnd"/>
+            <w:r>
+              <w:rPr>
+                <w:rFonts w:ascii="Arial" w:hAnsi="Arial" w:cs="Arial"/>
+              </w:rPr>
+              <w:t xml:space="preserve"> in </w:t>
+            </w:r>
+            <w:proofErr w:type="spellStart"/>
+            <w:r>
+              <w:rPr>
+                <w:rFonts w:ascii="Arial" w:hAnsi="Arial" w:cs="Arial"/>
+              </w:rPr>
+              <w:t>participants</w:t>
+            </w:r>
+            <w:proofErr w:type="spellEnd"/>
+            <w:r>
+              <w:rPr>
+                <w:rFonts w:ascii="Arial" w:hAnsi="Arial" w:cs="Arial"/>
+              </w:rPr>
+              <w:t xml:space="preserve"> %}</w:t>
             </w:r>
           </w:p>
         </w:tc>
@@ -431,13 +686,41 @@
                 <w:szCs w:val="22"/>
               </w:rPr>
             </w:pPr>
+            <w:proofErr w:type="gramStart"/>
             <w:r>
               <w:rPr>
                 <w:rFonts w:ascii="Arial" w:hAnsi="Arial" w:cs="Arial"/>
                 <w:sz w:val="22"/>
                 <w:szCs w:val="22"/>
               </w:rPr>
-              <w:t>{{ participant.first_name }}</w:t>
+              <w:t xml:space="preserve">{{ </w:t>
+            </w:r>
+            <w:proofErr w:type="spellStart"/>
+            <w:r>
+              <w:rPr>
+                <w:rFonts w:ascii="Arial" w:hAnsi="Arial" w:cs="Arial"/>
+                <w:sz w:val="22"/>
+                <w:szCs w:val="22"/>
+              </w:rPr>
+              <w:t>participant</w:t>
+            </w:r>
+            <w:proofErr w:type="gramEnd"/>
+            <w:r>
+              <w:rPr>
+                <w:rFonts w:ascii="Arial" w:hAnsi="Arial" w:cs="Arial"/>
+                <w:sz w:val="22"/>
+                <w:szCs w:val="22"/>
+              </w:rPr>
+              <w:t>.first_name</w:t>
+            </w:r>
+            <w:proofErr w:type="spellEnd"/>
+            <w:r>
+              <w:rPr>
+                <w:rFonts w:ascii="Arial" w:hAnsi="Arial" w:cs="Arial"/>
+                <w:sz w:val="22"/>
+                <w:szCs w:val="22"/>
+              </w:rPr>
+              <w:t xml:space="preserve"> }}</w:t>
             </w:r>
           </w:p>
         </w:tc>
@@ -454,13 +737,41 @@
                 <w:szCs w:val="22"/>
               </w:rPr>
             </w:pPr>
+            <w:proofErr w:type="gramStart"/>
             <w:r>
               <w:rPr>
                 <w:rFonts w:ascii="Arial" w:hAnsi="Arial" w:cs="Arial"/>
                 <w:sz w:val="22"/>
                 <w:szCs w:val="22"/>
               </w:rPr>
-              <w:t>{{ participant.last_name }}</w:t>
+              <w:t xml:space="preserve">{{ </w:t>
+            </w:r>
+            <w:proofErr w:type="spellStart"/>
+            <w:r>
+              <w:rPr>
+                <w:rFonts w:ascii="Arial" w:hAnsi="Arial" w:cs="Arial"/>
+                <w:sz w:val="22"/>
+                <w:szCs w:val="22"/>
+              </w:rPr>
+              <w:t>participant</w:t>
+            </w:r>
+            <w:proofErr w:type="gramEnd"/>
+            <w:r>
+              <w:rPr>
+                <w:rFonts w:ascii="Arial" w:hAnsi="Arial" w:cs="Arial"/>
+                <w:sz w:val="22"/>
+                <w:szCs w:val="22"/>
+              </w:rPr>
+              <w:t>.last_name</w:t>
+            </w:r>
+            <w:proofErr w:type="spellEnd"/>
+            <w:r>
+              <w:rPr>
+                <w:rFonts w:ascii="Arial" w:hAnsi="Arial" w:cs="Arial"/>
+                <w:sz w:val="22"/>
+                <w:szCs w:val="22"/>
+              </w:rPr>
+              <w:t xml:space="preserve"> }}</w:t>
             </w:r>
           </w:p>
         </w:tc>
@@ -477,13 +788,41 @@
                 <w:szCs w:val="22"/>
               </w:rPr>
             </w:pPr>
+            <w:proofErr w:type="gramStart"/>
             <w:r>
               <w:rPr>
                 <w:rFonts w:ascii="Arial" w:hAnsi="Arial" w:cs="Arial"/>
                 <w:sz w:val="22"/>
                 <w:szCs w:val="22"/>
               </w:rPr>
-              <w:t>{{ participant.gender }}</w:t>
+              <w:t xml:space="preserve">{{ </w:t>
+            </w:r>
+            <w:proofErr w:type="spellStart"/>
+            <w:r>
+              <w:rPr>
+                <w:rFonts w:ascii="Arial" w:hAnsi="Arial" w:cs="Arial"/>
+                <w:sz w:val="22"/>
+                <w:szCs w:val="22"/>
+              </w:rPr>
+              <w:t>participant</w:t>
+            </w:r>
+            <w:proofErr w:type="gramEnd"/>
+            <w:r>
+              <w:rPr>
+                <w:rFonts w:ascii="Arial" w:hAnsi="Arial" w:cs="Arial"/>
+                <w:sz w:val="22"/>
+                <w:szCs w:val="22"/>
+              </w:rPr>
+              <w:t>.gender</w:t>
+            </w:r>
+            <w:proofErr w:type="spellEnd"/>
+            <w:r>
+              <w:rPr>
+                <w:rFonts w:ascii="Arial" w:hAnsi="Arial" w:cs="Arial"/>
+                <w:sz w:val="22"/>
+                <w:szCs w:val="22"/>
+              </w:rPr>
+              <w:t xml:space="preserve"> }}</w:t>
             </w:r>
           </w:p>
         </w:tc>
@@ -500,13 +839,33 @@
                 <w:szCs w:val="22"/>
               </w:rPr>
             </w:pPr>
+            <w:proofErr w:type="gramStart"/>
             <w:r>
               <w:rPr>
                 <w:rFonts w:ascii="Arial" w:hAnsi="Arial" w:cs="Arial"/>
                 <w:sz w:val="22"/>
                 <w:szCs w:val="22"/>
               </w:rPr>
-              <w:t>{{ participant.age }}</w:t>
+              <w:t xml:space="preserve">{{ </w:t>
+            </w:r>
+            <w:proofErr w:type="spellStart"/>
+            <w:r>
+              <w:rPr>
+                <w:rFonts w:ascii="Arial" w:hAnsi="Arial" w:cs="Arial"/>
+                <w:sz w:val="22"/>
+                <w:szCs w:val="22"/>
+              </w:rPr>
+              <w:t>participant.age</w:t>
+            </w:r>
+            <w:proofErr w:type="spellEnd"/>
+            <w:proofErr w:type="gramEnd"/>
+            <w:r>
+              <w:rPr>
+                <w:rFonts w:ascii="Arial" w:hAnsi="Arial" w:cs="Arial"/>
+                <w:sz w:val="22"/>
+                <w:szCs w:val="22"/>
+              </w:rPr>
+              <w:t xml:space="preserve"> }}</w:t>
             </w:r>
           </w:p>
         </w:tc>
@@ -527,7 +886,35 @@
               <w:rPr>
                 <w:rFonts w:ascii="Arial" w:hAnsi="Arial" w:cs="Arial"/>
               </w:rPr>
-              <w:t>{%tr endfor %}</w:t>
+              <w:t>{%</w:t>
+            </w:r>
+            <w:proofErr w:type="spellStart"/>
+            <w:r>
+              <w:rPr>
+                <w:rFonts w:ascii="Arial" w:hAnsi="Arial" w:cs="Arial"/>
+              </w:rPr>
+              <w:t>tr</w:t>
+            </w:r>
+            <w:proofErr w:type="spellEnd"/>
+            <w:r>
+              <w:rPr>
+                <w:rFonts w:ascii="Arial" w:hAnsi="Arial" w:cs="Arial"/>
+              </w:rPr>
+              <w:t xml:space="preserve"> </w:t>
+            </w:r>
+            <w:proofErr w:type="spellStart"/>
+            <w:r>
+              <w:rPr>
+                <w:rFonts w:ascii="Arial" w:hAnsi="Arial" w:cs="Arial"/>
+              </w:rPr>
+              <w:t>endfor</w:t>
+            </w:r>
+            <w:proofErr w:type="spellEnd"/>
+            <w:r>
+              <w:rPr>
+                <w:rFonts w:ascii="Arial" w:hAnsi="Arial" w:cs="Arial"/>
+              </w:rPr>
+              <w:t xml:space="preserve"> %}</w:t>
             </w:r>
           </w:p>
         </w:tc>
@@ -593,7 +980,43 @@
           <w:sz w:val="22"/>
           <w:szCs w:val="22"/>
         </w:rPr>
-        <w:t>{%p if show_large_participant_notice %}</w:t>
+        <w:t xml:space="preserve">{%p </w:t>
+      </w:r>
+      <w:proofErr w:type="spellStart"/>
+      <w:r>
+        <w:rPr>
+          <w:rFonts w:ascii="Arial" w:hAnsi="Arial" w:cs="Arial"/>
+          <w:sz w:val="22"/>
+          <w:szCs w:val="22"/>
+        </w:rPr>
+        <w:t>if</w:t>
+      </w:r>
+      <w:proofErr w:type="spellEnd"/>
+      <w:r>
+        <w:rPr>
+          <w:rFonts w:ascii="Arial" w:hAnsi="Arial" w:cs="Arial"/>
+          <w:sz w:val="22"/>
+          <w:szCs w:val="22"/>
+        </w:rPr>
+        <w:t xml:space="preserve"> </w:t>
+      </w:r>
+      <w:proofErr w:type="spellStart"/>
+      <w:r>
+        <w:rPr>
+          <w:rFonts w:ascii="Arial" w:hAnsi="Arial" w:cs="Arial"/>
+          <w:sz w:val="22"/>
+          <w:szCs w:val="22"/>
+        </w:rPr>
+        <w:t>show_large_participant_notice</w:t>
+      </w:r>
+      <w:proofErr w:type="spellEnd"/>
+      <w:r>
+        <w:rPr>
+          <w:rFonts w:ascii="Arial" w:hAnsi="Arial" w:cs="Arial"/>
+          <w:sz w:val="22"/>
+          <w:szCs w:val="22"/>
+        </w:rPr>
+        <w:t xml:space="preserve"> %}</w:t>
       </w:r>
     </w:p>
     <w:p>
@@ -606,14 +1029,2374 @@
           <w:szCs w:val="22"/>
         </w:rPr>
       </w:pPr>
-      <w:r>
-        <w:rPr>
-          <w:rFonts w:ascii="Arial" w:hAnsi="Arial" w:cs="Arial"/>
-          <w:sz w:val="22"/>
-          <w:szCs w:val="22"/>
-        </w:rPr>
-        <w:t>Lorem ipsum dolor sit amet, consetetur sadipscing elitr, sed diam nonumy eirmod tempor invidunt ut labore et dolore magna aliquyam erat, sed diam voluptua. At vero eos et accusam et justo duo dolores et ea rebum. Stet clita kasd gubergren, no sea takimata sanctus est Lorem ipsum dolor sit amet. Lorem ipsum dolor sit amet, consetetur sadipscing elitr, sed diam nonumy eirmod tempor invidunt ut labore et dolore magna aliquyam erat, sed diam voluptua. At vero eos et accusam et justo duo dolores et ea rebum. Stet clita kasd gubergren, no sea takimata sanctus est Lorem ipsum dolor sit amet. Lorem ipsum dolor sit amet, consetetur sadipscing elitr, sed diam nonumy eirmod tempor invidunt ut labore et dolore magna aliquyam erat, sed diam voluptua. At vero eos et accusam et justo duo dolores et ea rebum. Stet clita kasd gubergren, no sea takimata sanctus est Lorem ipsum dolor sit amet. Duis autem vel eum iriure dolor in hendrerit in vulputate velit esse molestie consequat, vel illum dolore eu feugiat</w:t>
-      </w:r>
+      <w:proofErr w:type="spellStart"/>
+      <w:r>
+        <w:rPr>
+          <w:rFonts w:ascii="Arial" w:hAnsi="Arial" w:cs="Arial"/>
+          <w:sz w:val="22"/>
+          <w:szCs w:val="22"/>
+        </w:rPr>
+        <w:t>Lorem</w:t>
+      </w:r>
+      <w:proofErr w:type="spellEnd"/>
+      <w:r>
+        <w:rPr>
+          <w:rFonts w:ascii="Arial" w:hAnsi="Arial" w:cs="Arial"/>
+          <w:sz w:val="22"/>
+          <w:szCs w:val="22"/>
+        </w:rPr>
+        <w:t xml:space="preserve"> </w:t>
+      </w:r>
+      <w:proofErr w:type="spellStart"/>
+      <w:r>
+        <w:rPr>
+          <w:rFonts w:ascii="Arial" w:hAnsi="Arial" w:cs="Arial"/>
+          <w:sz w:val="22"/>
+          <w:szCs w:val="22"/>
+        </w:rPr>
+        <w:t>ipsum</w:t>
+      </w:r>
+      <w:proofErr w:type="spellEnd"/>
+      <w:r>
+        <w:rPr>
+          <w:rFonts w:ascii="Arial" w:hAnsi="Arial" w:cs="Arial"/>
+          <w:sz w:val="22"/>
+          <w:szCs w:val="22"/>
+        </w:rPr>
+        <w:t xml:space="preserve"> </w:t>
+      </w:r>
+      <w:proofErr w:type="spellStart"/>
+      <w:r>
+        <w:rPr>
+          <w:rFonts w:ascii="Arial" w:hAnsi="Arial" w:cs="Arial"/>
+          <w:sz w:val="22"/>
+          <w:szCs w:val="22"/>
+        </w:rPr>
+        <w:t>dolor</w:t>
+      </w:r>
+      <w:proofErr w:type="spellEnd"/>
+      <w:r>
+        <w:rPr>
+          <w:rFonts w:ascii="Arial" w:hAnsi="Arial" w:cs="Arial"/>
+          <w:sz w:val="22"/>
+          <w:szCs w:val="22"/>
+        </w:rPr>
+        <w:t xml:space="preserve"> </w:t>
+      </w:r>
+      <w:proofErr w:type="spellStart"/>
+      <w:r>
+        <w:rPr>
+          <w:rFonts w:ascii="Arial" w:hAnsi="Arial" w:cs="Arial"/>
+          <w:sz w:val="22"/>
+          <w:szCs w:val="22"/>
+        </w:rPr>
+        <w:t>sit</w:t>
+      </w:r>
+      <w:proofErr w:type="spellEnd"/>
+      <w:r>
+        <w:rPr>
+          <w:rFonts w:ascii="Arial" w:hAnsi="Arial" w:cs="Arial"/>
+          <w:sz w:val="22"/>
+          <w:szCs w:val="22"/>
+        </w:rPr>
+        <w:t xml:space="preserve"> </w:t>
+      </w:r>
+      <w:proofErr w:type="spellStart"/>
+      <w:r>
+        <w:rPr>
+          <w:rFonts w:ascii="Arial" w:hAnsi="Arial" w:cs="Arial"/>
+          <w:sz w:val="22"/>
+          <w:szCs w:val="22"/>
+        </w:rPr>
+        <w:t>amet</w:t>
+      </w:r>
+      <w:proofErr w:type="spellEnd"/>
+      <w:r>
+        <w:rPr>
+          <w:rFonts w:ascii="Arial" w:hAnsi="Arial" w:cs="Arial"/>
+          <w:sz w:val="22"/>
+          <w:szCs w:val="22"/>
+        </w:rPr>
+        <w:t xml:space="preserve">, </w:t>
+      </w:r>
+      <w:proofErr w:type="spellStart"/>
+      <w:r>
+        <w:rPr>
+          <w:rFonts w:ascii="Arial" w:hAnsi="Arial" w:cs="Arial"/>
+          <w:sz w:val="22"/>
+          <w:szCs w:val="22"/>
+        </w:rPr>
+        <w:t>consetetur</w:t>
+      </w:r>
+      <w:proofErr w:type="spellEnd"/>
+      <w:r>
+        <w:rPr>
+          <w:rFonts w:ascii="Arial" w:hAnsi="Arial" w:cs="Arial"/>
+          <w:sz w:val="22"/>
+          <w:szCs w:val="22"/>
+        </w:rPr>
+        <w:t xml:space="preserve"> </w:t>
+      </w:r>
+      <w:proofErr w:type="spellStart"/>
+      <w:r>
+        <w:rPr>
+          <w:rFonts w:ascii="Arial" w:hAnsi="Arial" w:cs="Arial"/>
+          <w:sz w:val="22"/>
+          <w:szCs w:val="22"/>
+        </w:rPr>
+        <w:t>sadipscing</w:t>
+      </w:r>
+      <w:proofErr w:type="spellEnd"/>
+      <w:r>
+        <w:rPr>
+          <w:rFonts w:ascii="Arial" w:hAnsi="Arial" w:cs="Arial"/>
+          <w:sz w:val="22"/>
+          <w:szCs w:val="22"/>
+        </w:rPr>
+        <w:t xml:space="preserve"> </w:t>
+      </w:r>
+      <w:proofErr w:type="spellStart"/>
+      <w:r>
+        <w:rPr>
+          <w:rFonts w:ascii="Arial" w:hAnsi="Arial" w:cs="Arial"/>
+          <w:sz w:val="22"/>
+          <w:szCs w:val="22"/>
+        </w:rPr>
+        <w:t>elitr</w:t>
+      </w:r>
+      <w:proofErr w:type="spellEnd"/>
+      <w:r>
+        <w:rPr>
+          <w:rFonts w:ascii="Arial" w:hAnsi="Arial" w:cs="Arial"/>
+          <w:sz w:val="22"/>
+          <w:szCs w:val="22"/>
+        </w:rPr>
+        <w:t xml:space="preserve">, sed </w:t>
+      </w:r>
+      <w:proofErr w:type="spellStart"/>
+      <w:r>
+        <w:rPr>
+          <w:rFonts w:ascii="Arial" w:hAnsi="Arial" w:cs="Arial"/>
+          <w:sz w:val="22"/>
+          <w:szCs w:val="22"/>
+        </w:rPr>
+        <w:t>diam</w:t>
+      </w:r>
+      <w:proofErr w:type="spellEnd"/>
+      <w:r>
+        <w:rPr>
+          <w:rFonts w:ascii="Arial" w:hAnsi="Arial" w:cs="Arial"/>
+          <w:sz w:val="22"/>
+          <w:szCs w:val="22"/>
+        </w:rPr>
+        <w:t xml:space="preserve"> </w:t>
+      </w:r>
+      <w:proofErr w:type="spellStart"/>
+      <w:r>
+        <w:rPr>
+          <w:rFonts w:ascii="Arial" w:hAnsi="Arial" w:cs="Arial"/>
+          <w:sz w:val="22"/>
+          <w:szCs w:val="22"/>
+        </w:rPr>
+        <w:t>nonumy</w:t>
+      </w:r>
+      <w:proofErr w:type="spellEnd"/>
+      <w:r>
+        <w:rPr>
+          <w:rFonts w:ascii="Arial" w:hAnsi="Arial" w:cs="Arial"/>
+          <w:sz w:val="22"/>
+          <w:szCs w:val="22"/>
+        </w:rPr>
+        <w:t xml:space="preserve"> </w:t>
+      </w:r>
+      <w:proofErr w:type="spellStart"/>
+      <w:r>
+        <w:rPr>
+          <w:rFonts w:ascii="Arial" w:hAnsi="Arial" w:cs="Arial"/>
+          <w:sz w:val="22"/>
+          <w:szCs w:val="22"/>
+        </w:rPr>
+        <w:t>eirmod</w:t>
+      </w:r>
+      <w:proofErr w:type="spellEnd"/>
+      <w:r>
+        <w:rPr>
+          <w:rFonts w:ascii="Arial" w:hAnsi="Arial" w:cs="Arial"/>
+          <w:sz w:val="22"/>
+          <w:szCs w:val="22"/>
+        </w:rPr>
+        <w:t xml:space="preserve"> </w:t>
+      </w:r>
+      <w:proofErr w:type="spellStart"/>
+      <w:r>
+        <w:rPr>
+          <w:rFonts w:ascii="Arial" w:hAnsi="Arial" w:cs="Arial"/>
+          <w:sz w:val="22"/>
+          <w:szCs w:val="22"/>
+        </w:rPr>
+        <w:t>tempor</w:t>
+      </w:r>
+      <w:proofErr w:type="spellEnd"/>
+      <w:r>
+        <w:rPr>
+          <w:rFonts w:ascii="Arial" w:hAnsi="Arial" w:cs="Arial"/>
+          <w:sz w:val="22"/>
+          <w:szCs w:val="22"/>
+        </w:rPr>
+        <w:t xml:space="preserve"> </w:t>
+      </w:r>
+      <w:proofErr w:type="spellStart"/>
+      <w:r>
+        <w:rPr>
+          <w:rFonts w:ascii="Arial" w:hAnsi="Arial" w:cs="Arial"/>
+          <w:sz w:val="22"/>
+          <w:szCs w:val="22"/>
+        </w:rPr>
+        <w:t>invidunt</w:t>
+      </w:r>
+      <w:proofErr w:type="spellEnd"/>
+      <w:r>
+        <w:rPr>
+          <w:rFonts w:ascii="Arial" w:hAnsi="Arial" w:cs="Arial"/>
+          <w:sz w:val="22"/>
+          <w:szCs w:val="22"/>
+        </w:rPr>
+        <w:t xml:space="preserve"> </w:t>
+      </w:r>
+      <w:proofErr w:type="spellStart"/>
+      <w:r>
+        <w:rPr>
+          <w:rFonts w:ascii="Arial" w:hAnsi="Arial" w:cs="Arial"/>
+          <w:sz w:val="22"/>
+          <w:szCs w:val="22"/>
+        </w:rPr>
+        <w:t>ut</w:t>
+      </w:r>
+      <w:proofErr w:type="spellEnd"/>
+      <w:r>
+        <w:rPr>
+          <w:rFonts w:ascii="Arial" w:hAnsi="Arial" w:cs="Arial"/>
+          <w:sz w:val="22"/>
+          <w:szCs w:val="22"/>
+        </w:rPr>
+        <w:t xml:space="preserve"> </w:t>
+      </w:r>
+      <w:proofErr w:type="spellStart"/>
+      <w:r>
+        <w:rPr>
+          <w:rFonts w:ascii="Arial" w:hAnsi="Arial" w:cs="Arial"/>
+          <w:sz w:val="22"/>
+          <w:szCs w:val="22"/>
+        </w:rPr>
+        <w:t>labore</w:t>
+      </w:r>
+      <w:proofErr w:type="spellEnd"/>
+      <w:r>
+        <w:rPr>
+          <w:rFonts w:ascii="Arial" w:hAnsi="Arial" w:cs="Arial"/>
+          <w:sz w:val="22"/>
+          <w:szCs w:val="22"/>
+        </w:rPr>
+        <w:t xml:space="preserve"> et </w:t>
+      </w:r>
+      <w:proofErr w:type="spellStart"/>
+      <w:r>
+        <w:rPr>
+          <w:rFonts w:ascii="Arial" w:hAnsi="Arial" w:cs="Arial"/>
+          <w:sz w:val="22"/>
+          <w:szCs w:val="22"/>
+        </w:rPr>
+        <w:t>dolore</w:t>
+      </w:r>
+      <w:proofErr w:type="spellEnd"/>
+      <w:r>
+        <w:rPr>
+          <w:rFonts w:ascii="Arial" w:hAnsi="Arial" w:cs="Arial"/>
+          <w:sz w:val="22"/>
+          <w:szCs w:val="22"/>
+        </w:rPr>
+        <w:t xml:space="preserve"> magna </w:t>
+      </w:r>
+      <w:proofErr w:type="spellStart"/>
+      <w:r>
+        <w:rPr>
+          <w:rFonts w:ascii="Arial" w:hAnsi="Arial" w:cs="Arial"/>
+          <w:sz w:val="22"/>
+          <w:szCs w:val="22"/>
+        </w:rPr>
+        <w:t>aliquyam</w:t>
+      </w:r>
+      <w:proofErr w:type="spellEnd"/>
+      <w:r>
+        <w:rPr>
+          <w:rFonts w:ascii="Arial" w:hAnsi="Arial" w:cs="Arial"/>
+          <w:sz w:val="22"/>
+          <w:szCs w:val="22"/>
+        </w:rPr>
+        <w:t xml:space="preserve"> erat, sed </w:t>
+      </w:r>
+      <w:proofErr w:type="spellStart"/>
+      <w:r>
+        <w:rPr>
+          <w:rFonts w:ascii="Arial" w:hAnsi="Arial" w:cs="Arial"/>
+          <w:sz w:val="22"/>
+          <w:szCs w:val="22"/>
+        </w:rPr>
+        <w:t>diam</w:t>
+      </w:r>
+      <w:proofErr w:type="spellEnd"/>
+      <w:r>
+        <w:rPr>
+          <w:rFonts w:ascii="Arial" w:hAnsi="Arial" w:cs="Arial"/>
+          <w:sz w:val="22"/>
+          <w:szCs w:val="22"/>
+        </w:rPr>
+        <w:t xml:space="preserve"> </w:t>
+      </w:r>
+      <w:proofErr w:type="spellStart"/>
+      <w:r>
+        <w:rPr>
+          <w:rFonts w:ascii="Arial" w:hAnsi="Arial" w:cs="Arial"/>
+          <w:sz w:val="22"/>
+          <w:szCs w:val="22"/>
+        </w:rPr>
+        <w:t>voluptua</w:t>
+      </w:r>
+      <w:proofErr w:type="spellEnd"/>
+      <w:r>
+        <w:rPr>
+          <w:rFonts w:ascii="Arial" w:hAnsi="Arial" w:cs="Arial"/>
+          <w:sz w:val="22"/>
+          <w:szCs w:val="22"/>
+        </w:rPr>
+        <w:t xml:space="preserve">. At </w:t>
+      </w:r>
+      <w:proofErr w:type="spellStart"/>
+      <w:r>
+        <w:rPr>
+          <w:rFonts w:ascii="Arial" w:hAnsi="Arial" w:cs="Arial"/>
+          <w:sz w:val="22"/>
+          <w:szCs w:val="22"/>
+        </w:rPr>
+        <w:t>vero</w:t>
+      </w:r>
+      <w:proofErr w:type="spellEnd"/>
+      <w:r>
+        <w:rPr>
+          <w:rFonts w:ascii="Arial" w:hAnsi="Arial" w:cs="Arial"/>
+          <w:sz w:val="22"/>
+          <w:szCs w:val="22"/>
+        </w:rPr>
+        <w:t xml:space="preserve"> </w:t>
+      </w:r>
+      <w:proofErr w:type="spellStart"/>
+      <w:r>
+        <w:rPr>
+          <w:rFonts w:ascii="Arial" w:hAnsi="Arial" w:cs="Arial"/>
+          <w:sz w:val="22"/>
+          <w:szCs w:val="22"/>
+        </w:rPr>
+        <w:t>eos</w:t>
+      </w:r>
+      <w:proofErr w:type="spellEnd"/>
+      <w:r>
+        <w:rPr>
+          <w:rFonts w:ascii="Arial" w:hAnsi="Arial" w:cs="Arial"/>
+          <w:sz w:val="22"/>
+          <w:szCs w:val="22"/>
+        </w:rPr>
+        <w:t xml:space="preserve"> et </w:t>
+      </w:r>
+      <w:proofErr w:type="spellStart"/>
+      <w:r>
+        <w:rPr>
+          <w:rFonts w:ascii="Arial" w:hAnsi="Arial" w:cs="Arial"/>
+          <w:sz w:val="22"/>
+          <w:szCs w:val="22"/>
+        </w:rPr>
+        <w:t>accusam</w:t>
+      </w:r>
+      <w:proofErr w:type="spellEnd"/>
+      <w:r>
+        <w:rPr>
+          <w:rFonts w:ascii="Arial" w:hAnsi="Arial" w:cs="Arial"/>
+          <w:sz w:val="22"/>
+          <w:szCs w:val="22"/>
+        </w:rPr>
+        <w:t xml:space="preserve"> et </w:t>
+      </w:r>
+      <w:proofErr w:type="spellStart"/>
+      <w:r>
+        <w:rPr>
+          <w:rFonts w:ascii="Arial" w:hAnsi="Arial" w:cs="Arial"/>
+          <w:sz w:val="22"/>
+          <w:szCs w:val="22"/>
+        </w:rPr>
+        <w:t>justo</w:t>
+      </w:r>
+      <w:proofErr w:type="spellEnd"/>
+      <w:r>
+        <w:rPr>
+          <w:rFonts w:ascii="Arial" w:hAnsi="Arial" w:cs="Arial"/>
+          <w:sz w:val="22"/>
+          <w:szCs w:val="22"/>
+        </w:rPr>
+        <w:t xml:space="preserve"> </w:t>
+      </w:r>
+      <w:proofErr w:type="spellStart"/>
+      <w:r>
+        <w:rPr>
+          <w:rFonts w:ascii="Arial" w:hAnsi="Arial" w:cs="Arial"/>
+          <w:sz w:val="22"/>
+          <w:szCs w:val="22"/>
+        </w:rPr>
+        <w:t>duo</w:t>
+      </w:r>
+      <w:proofErr w:type="spellEnd"/>
+      <w:r>
+        <w:rPr>
+          <w:rFonts w:ascii="Arial" w:hAnsi="Arial" w:cs="Arial"/>
+          <w:sz w:val="22"/>
+          <w:szCs w:val="22"/>
+        </w:rPr>
+        <w:t xml:space="preserve"> </w:t>
+      </w:r>
+      <w:proofErr w:type="spellStart"/>
+      <w:r>
+        <w:rPr>
+          <w:rFonts w:ascii="Arial" w:hAnsi="Arial" w:cs="Arial"/>
+          <w:sz w:val="22"/>
+          <w:szCs w:val="22"/>
+        </w:rPr>
+        <w:t>dolores</w:t>
+      </w:r>
+      <w:proofErr w:type="spellEnd"/>
+      <w:r>
+        <w:rPr>
+          <w:rFonts w:ascii="Arial" w:hAnsi="Arial" w:cs="Arial"/>
+          <w:sz w:val="22"/>
+          <w:szCs w:val="22"/>
+        </w:rPr>
+        <w:t xml:space="preserve"> et </w:t>
+      </w:r>
+      <w:proofErr w:type="spellStart"/>
+      <w:r>
+        <w:rPr>
+          <w:rFonts w:ascii="Arial" w:hAnsi="Arial" w:cs="Arial"/>
+          <w:sz w:val="22"/>
+          <w:szCs w:val="22"/>
+        </w:rPr>
+        <w:t>ea</w:t>
+      </w:r>
+      <w:proofErr w:type="spellEnd"/>
+      <w:r>
+        <w:rPr>
+          <w:rFonts w:ascii="Arial" w:hAnsi="Arial" w:cs="Arial"/>
+          <w:sz w:val="22"/>
+          <w:szCs w:val="22"/>
+        </w:rPr>
+        <w:t xml:space="preserve"> </w:t>
+      </w:r>
+      <w:proofErr w:type="spellStart"/>
+      <w:r>
+        <w:rPr>
+          <w:rFonts w:ascii="Arial" w:hAnsi="Arial" w:cs="Arial"/>
+          <w:sz w:val="22"/>
+          <w:szCs w:val="22"/>
+        </w:rPr>
+        <w:t>rebum</w:t>
+      </w:r>
+      <w:proofErr w:type="spellEnd"/>
+      <w:r>
+        <w:rPr>
+          <w:rFonts w:ascii="Arial" w:hAnsi="Arial" w:cs="Arial"/>
+          <w:sz w:val="22"/>
+          <w:szCs w:val="22"/>
+        </w:rPr>
+        <w:t xml:space="preserve">. Stet </w:t>
+      </w:r>
+      <w:proofErr w:type="spellStart"/>
+      <w:r>
+        <w:rPr>
+          <w:rFonts w:ascii="Arial" w:hAnsi="Arial" w:cs="Arial"/>
+          <w:sz w:val="22"/>
+          <w:szCs w:val="22"/>
+        </w:rPr>
+        <w:t>clita</w:t>
+      </w:r>
+      <w:proofErr w:type="spellEnd"/>
+      <w:r>
+        <w:rPr>
+          <w:rFonts w:ascii="Arial" w:hAnsi="Arial" w:cs="Arial"/>
+          <w:sz w:val="22"/>
+          <w:szCs w:val="22"/>
+        </w:rPr>
+        <w:t xml:space="preserve"> </w:t>
+      </w:r>
+      <w:proofErr w:type="spellStart"/>
+      <w:r>
+        <w:rPr>
+          <w:rFonts w:ascii="Arial" w:hAnsi="Arial" w:cs="Arial"/>
+          <w:sz w:val="22"/>
+          <w:szCs w:val="22"/>
+        </w:rPr>
+        <w:t>kasd</w:t>
+      </w:r>
+      <w:proofErr w:type="spellEnd"/>
+      <w:r>
+        <w:rPr>
+          <w:rFonts w:ascii="Arial" w:hAnsi="Arial" w:cs="Arial"/>
+          <w:sz w:val="22"/>
+          <w:szCs w:val="22"/>
+        </w:rPr>
+        <w:t xml:space="preserve"> </w:t>
+      </w:r>
+      <w:proofErr w:type="spellStart"/>
+      <w:r>
+        <w:rPr>
+          <w:rFonts w:ascii="Arial" w:hAnsi="Arial" w:cs="Arial"/>
+          <w:sz w:val="22"/>
+          <w:szCs w:val="22"/>
+        </w:rPr>
+        <w:t>gubergren</w:t>
+      </w:r>
+      <w:proofErr w:type="spellEnd"/>
+      <w:r>
+        <w:rPr>
+          <w:rFonts w:ascii="Arial" w:hAnsi="Arial" w:cs="Arial"/>
+          <w:sz w:val="22"/>
+          <w:szCs w:val="22"/>
+        </w:rPr>
+        <w:t xml:space="preserve">, </w:t>
+      </w:r>
+      <w:proofErr w:type="spellStart"/>
+      <w:r>
+        <w:rPr>
+          <w:rFonts w:ascii="Arial" w:hAnsi="Arial" w:cs="Arial"/>
+          <w:sz w:val="22"/>
+          <w:szCs w:val="22"/>
+        </w:rPr>
+        <w:t>no</w:t>
+      </w:r>
+      <w:proofErr w:type="spellEnd"/>
+      <w:r>
+        <w:rPr>
+          <w:rFonts w:ascii="Arial" w:hAnsi="Arial" w:cs="Arial"/>
+          <w:sz w:val="22"/>
+          <w:szCs w:val="22"/>
+        </w:rPr>
+        <w:t xml:space="preserve"> </w:t>
+      </w:r>
+      <w:proofErr w:type="spellStart"/>
+      <w:r>
+        <w:rPr>
+          <w:rFonts w:ascii="Arial" w:hAnsi="Arial" w:cs="Arial"/>
+          <w:sz w:val="22"/>
+          <w:szCs w:val="22"/>
+        </w:rPr>
+        <w:t>sea</w:t>
+      </w:r>
+      <w:proofErr w:type="spellEnd"/>
+      <w:r>
+        <w:rPr>
+          <w:rFonts w:ascii="Arial" w:hAnsi="Arial" w:cs="Arial"/>
+          <w:sz w:val="22"/>
+          <w:szCs w:val="22"/>
+        </w:rPr>
+        <w:t xml:space="preserve"> </w:t>
+      </w:r>
+      <w:proofErr w:type="spellStart"/>
+      <w:r>
+        <w:rPr>
+          <w:rFonts w:ascii="Arial" w:hAnsi="Arial" w:cs="Arial"/>
+          <w:sz w:val="22"/>
+          <w:szCs w:val="22"/>
+        </w:rPr>
+        <w:t>takimata</w:t>
+      </w:r>
+      <w:proofErr w:type="spellEnd"/>
+      <w:r>
+        <w:rPr>
+          <w:rFonts w:ascii="Arial" w:hAnsi="Arial" w:cs="Arial"/>
+          <w:sz w:val="22"/>
+          <w:szCs w:val="22"/>
+        </w:rPr>
+        <w:t xml:space="preserve"> sanctus </w:t>
+      </w:r>
+      <w:proofErr w:type="spellStart"/>
+      <w:r>
+        <w:rPr>
+          <w:rFonts w:ascii="Arial" w:hAnsi="Arial" w:cs="Arial"/>
+          <w:sz w:val="22"/>
+          <w:szCs w:val="22"/>
+        </w:rPr>
+        <w:t>est</w:t>
+      </w:r>
+      <w:proofErr w:type="spellEnd"/>
+      <w:r>
+        <w:rPr>
+          <w:rFonts w:ascii="Arial" w:hAnsi="Arial" w:cs="Arial"/>
+          <w:sz w:val="22"/>
+          <w:szCs w:val="22"/>
+        </w:rPr>
+        <w:t xml:space="preserve"> </w:t>
+      </w:r>
+      <w:proofErr w:type="spellStart"/>
+      <w:r>
+        <w:rPr>
+          <w:rFonts w:ascii="Arial" w:hAnsi="Arial" w:cs="Arial"/>
+          <w:sz w:val="22"/>
+          <w:szCs w:val="22"/>
+        </w:rPr>
+        <w:t>Lorem</w:t>
+      </w:r>
+      <w:proofErr w:type="spellEnd"/>
+      <w:r>
+        <w:rPr>
+          <w:rFonts w:ascii="Arial" w:hAnsi="Arial" w:cs="Arial"/>
+          <w:sz w:val="22"/>
+          <w:szCs w:val="22"/>
+        </w:rPr>
+        <w:t xml:space="preserve"> </w:t>
+      </w:r>
+      <w:proofErr w:type="spellStart"/>
+      <w:r>
+        <w:rPr>
+          <w:rFonts w:ascii="Arial" w:hAnsi="Arial" w:cs="Arial"/>
+          <w:sz w:val="22"/>
+          <w:szCs w:val="22"/>
+        </w:rPr>
+        <w:t>ipsum</w:t>
+      </w:r>
+      <w:proofErr w:type="spellEnd"/>
+      <w:r>
+        <w:rPr>
+          <w:rFonts w:ascii="Arial" w:hAnsi="Arial" w:cs="Arial"/>
+          <w:sz w:val="22"/>
+          <w:szCs w:val="22"/>
+        </w:rPr>
+        <w:t xml:space="preserve"> </w:t>
+      </w:r>
+      <w:proofErr w:type="spellStart"/>
+      <w:r>
+        <w:rPr>
+          <w:rFonts w:ascii="Arial" w:hAnsi="Arial" w:cs="Arial"/>
+          <w:sz w:val="22"/>
+          <w:szCs w:val="22"/>
+        </w:rPr>
+        <w:t>dolor</w:t>
+      </w:r>
+      <w:proofErr w:type="spellEnd"/>
+      <w:r>
+        <w:rPr>
+          <w:rFonts w:ascii="Arial" w:hAnsi="Arial" w:cs="Arial"/>
+          <w:sz w:val="22"/>
+          <w:szCs w:val="22"/>
+        </w:rPr>
+        <w:t xml:space="preserve"> </w:t>
+      </w:r>
+      <w:proofErr w:type="spellStart"/>
+      <w:r>
+        <w:rPr>
+          <w:rFonts w:ascii="Arial" w:hAnsi="Arial" w:cs="Arial"/>
+          <w:sz w:val="22"/>
+          <w:szCs w:val="22"/>
+        </w:rPr>
+        <w:t>sit</w:t>
+      </w:r>
+      <w:proofErr w:type="spellEnd"/>
+      <w:r>
+        <w:rPr>
+          <w:rFonts w:ascii="Arial" w:hAnsi="Arial" w:cs="Arial"/>
+          <w:sz w:val="22"/>
+          <w:szCs w:val="22"/>
+        </w:rPr>
+        <w:t xml:space="preserve"> </w:t>
+      </w:r>
+      <w:proofErr w:type="spellStart"/>
+      <w:r>
+        <w:rPr>
+          <w:rFonts w:ascii="Arial" w:hAnsi="Arial" w:cs="Arial"/>
+          <w:sz w:val="22"/>
+          <w:szCs w:val="22"/>
+        </w:rPr>
+        <w:t>amet</w:t>
+      </w:r>
+      <w:proofErr w:type="spellEnd"/>
+      <w:r>
+        <w:rPr>
+          <w:rFonts w:ascii="Arial" w:hAnsi="Arial" w:cs="Arial"/>
+          <w:sz w:val="22"/>
+          <w:szCs w:val="22"/>
+        </w:rPr>
+        <w:t xml:space="preserve">. </w:t>
+      </w:r>
+      <w:proofErr w:type="spellStart"/>
+      <w:r>
+        <w:rPr>
+          <w:rFonts w:ascii="Arial" w:hAnsi="Arial" w:cs="Arial"/>
+          <w:sz w:val="22"/>
+          <w:szCs w:val="22"/>
+        </w:rPr>
+        <w:t>Lorem</w:t>
+      </w:r>
+      <w:proofErr w:type="spellEnd"/>
+      <w:r>
+        <w:rPr>
+          <w:rFonts w:ascii="Arial" w:hAnsi="Arial" w:cs="Arial"/>
+          <w:sz w:val="22"/>
+          <w:szCs w:val="22"/>
+        </w:rPr>
+        <w:t xml:space="preserve"> </w:t>
+      </w:r>
+      <w:proofErr w:type="spellStart"/>
+      <w:r>
+        <w:rPr>
+          <w:rFonts w:ascii="Arial" w:hAnsi="Arial" w:cs="Arial"/>
+          <w:sz w:val="22"/>
+          <w:szCs w:val="22"/>
+        </w:rPr>
+        <w:t>ipsum</w:t>
+      </w:r>
+      <w:proofErr w:type="spellEnd"/>
+      <w:r>
+        <w:rPr>
+          <w:rFonts w:ascii="Arial" w:hAnsi="Arial" w:cs="Arial"/>
+          <w:sz w:val="22"/>
+          <w:szCs w:val="22"/>
+        </w:rPr>
+        <w:t xml:space="preserve"> </w:t>
+      </w:r>
+      <w:proofErr w:type="spellStart"/>
+      <w:r>
+        <w:rPr>
+          <w:rFonts w:ascii="Arial" w:hAnsi="Arial" w:cs="Arial"/>
+          <w:sz w:val="22"/>
+          <w:szCs w:val="22"/>
+        </w:rPr>
+        <w:t>dolor</w:t>
+      </w:r>
+      <w:proofErr w:type="spellEnd"/>
+      <w:r>
+        <w:rPr>
+          <w:rFonts w:ascii="Arial" w:hAnsi="Arial" w:cs="Arial"/>
+          <w:sz w:val="22"/>
+          <w:szCs w:val="22"/>
+        </w:rPr>
+        <w:t xml:space="preserve"> </w:t>
+      </w:r>
+      <w:proofErr w:type="spellStart"/>
+      <w:r>
+        <w:rPr>
+          <w:rFonts w:ascii="Arial" w:hAnsi="Arial" w:cs="Arial"/>
+          <w:sz w:val="22"/>
+          <w:szCs w:val="22"/>
+        </w:rPr>
+        <w:t>sit</w:t>
+      </w:r>
+      <w:proofErr w:type="spellEnd"/>
+      <w:r>
+        <w:rPr>
+          <w:rFonts w:ascii="Arial" w:hAnsi="Arial" w:cs="Arial"/>
+          <w:sz w:val="22"/>
+          <w:szCs w:val="22"/>
+        </w:rPr>
+        <w:t xml:space="preserve"> </w:t>
+      </w:r>
+      <w:proofErr w:type="spellStart"/>
+      <w:r>
+        <w:rPr>
+          <w:rFonts w:ascii="Arial" w:hAnsi="Arial" w:cs="Arial"/>
+          <w:sz w:val="22"/>
+          <w:szCs w:val="22"/>
+        </w:rPr>
+        <w:t>amet</w:t>
+      </w:r>
+      <w:proofErr w:type="spellEnd"/>
+      <w:r>
+        <w:rPr>
+          <w:rFonts w:ascii="Arial" w:hAnsi="Arial" w:cs="Arial"/>
+          <w:sz w:val="22"/>
+          <w:szCs w:val="22"/>
+        </w:rPr>
+        <w:t xml:space="preserve">, </w:t>
+      </w:r>
+      <w:proofErr w:type="spellStart"/>
+      <w:r>
+        <w:rPr>
+          <w:rFonts w:ascii="Arial" w:hAnsi="Arial" w:cs="Arial"/>
+          <w:sz w:val="22"/>
+          <w:szCs w:val="22"/>
+        </w:rPr>
+        <w:t>consetetur</w:t>
+      </w:r>
+      <w:proofErr w:type="spellEnd"/>
+      <w:r>
+        <w:rPr>
+          <w:rFonts w:ascii="Arial" w:hAnsi="Arial" w:cs="Arial"/>
+          <w:sz w:val="22"/>
+          <w:szCs w:val="22"/>
+        </w:rPr>
+        <w:t xml:space="preserve"> </w:t>
+      </w:r>
+      <w:proofErr w:type="spellStart"/>
+      <w:r>
+        <w:rPr>
+          <w:rFonts w:ascii="Arial" w:hAnsi="Arial" w:cs="Arial"/>
+          <w:sz w:val="22"/>
+          <w:szCs w:val="22"/>
+        </w:rPr>
+        <w:t>sadipscing</w:t>
+      </w:r>
+      <w:proofErr w:type="spellEnd"/>
+      <w:r>
+        <w:rPr>
+          <w:rFonts w:ascii="Arial" w:hAnsi="Arial" w:cs="Arial"/>
+          <w:sz w:val="22"/>
+          <w:szCs w:val="22"/>
+        </w:rPr>
+        <w:t xml:space="preserve"> </w:t>
+      </w:r>
+      <w:proofErr w:type="spellStart"/>
+      <w:r>
+        <w:rPr>
+          <w:rFonts w:ascii="Arial" w:hAnsi="Arial" w:cs="Arial"/>
+          <w:sz w:val="22"/>
+          <w:szCs w:val="22"/>
+        </w:rPr>
+        <w:t>elitr</w:t>
+      </w:r>
+      <w:proofErr w:type="spellEnd"/>
+      <w:r>
+        <w:rPr>
+          <w:rFonts w:ascii="Arial" w:hAnsi="Arial" w:cs="Arial"/>
+          <w:sz w:val="22"/>
+          <w:szCs w:val="22"/>
+        </w:rPr>
+        <w:t xml:space="preserve">, sed </w:t>
+      </w:r>
+      <w:proofErr w:type="spellStart"/>
+      <w:r>
+        <w:rPr>
+          <w:rFonts w:ascii="Arial" w:hAnsi="Arial" w:cs="Arial"/>
+          <w:sz w:val="22"/>
+          <w:szCs w:val="22"/>
+        </w:rPr>
+        <w:t>diam</w:t>
+      </w:r>
+      <w:proofErr w:type="spellEnd"/>
+      <w:r>
+        <w:rPr>
+          <w:rFonts w:ascii="Arial" w:hAnsi="Arial" w:cs="Arial"/>
+          <w:sz w:val="22"/>
+          <w:szCs w:val="22"/>
+        </w:rPr>
+        <w:t xml:space="preserve"> </w:t>
+      </w:r>
+      <w:proofErr w:type="spellStart"/>
+      <w:r>
+        <w:rPr>
+          <w:rFonts w:ascii="Arial" w:hAnsi="Arial" w:cs="Arial"/>
+          <w:sz w:val="22"/>
+          <w:szCs w:val="22"/>
+        </w:rPr>
+        <w:t>nonumy</w:t>
+      </w:r>
+      <w:proofErr w:type="spellEnd"/>
+      <w:r>
+        <w:rPr>
+          <w:rFonts w:ascii="Arial" w:hAnsi="Arial" w:cs="Arial"/>
+          <w:sz w:val="22"/>
+          <w:szCs w:val="22"/>
+        </w:rPr>
+        <w:t xml:space="preserve"> </w:t>
+      </w:r>
+      <w:proofErr w:type="spellStart"/>
+      <w:r>
+        <w:rPr>
+          <w:rFonts w:ascii="Arial" w:hAnsi="Arial" w:cs="Arial"/>
+          <w:sz w:val="22"/>
+          <w:szCs w:val="22"/>
+        </w:rPr>
+        <w:t>eirmod</w:t>
+      </w:r>
+      <w:proofErr w:type="spellEnd"/>
+      <w:r>
+        <w:rPr>
+          <w:rFonts w:ascii="Arial" w:hAnsi="Arial" w:cs="Arial"/>
+          <w:sz w:val="22"/>
+          <w:szCs w:val="22"/>
+        </w:rPr>
+        <w:t xml:space="preserve"> </w:t>
+      </w:r>
+      <w:proofErr w:type="spellStart"/>
+      <w:r>
+        <w:rPr>
+          <w:rFonts w:ascii="Arial" w:hAnsi="Arial" w:cs="Arial"/>
+          <w:sz w:val="22"/>
+          <w:szCs w:val="22"/>
+        </w:rPr>
+        <w:t>tempor</w:t>
+      </w:r>
+      <w:proofErr w:type="spellEnd"/>
+      <w:r>
+        <w:rPr>
+          <w:rFonts w:ascii="Arial" w:hAnsi="Arial" w:cs="Arial"/>
+          <w:sz w:val="22"/>
+          <w:szCs w:val="22"/>
+        </w:rPr>
+        <w:t xml:space="preserve"> </w:t>
+      </w:r>
+      <w:proofErr w:type="spellStart"/>
+      <w:r>
+        <w:rPr>
+          <w:rFonts w:ascii="Arial" w:hAnsi="Arial" w:cs="Arial"/>
+          <w:sz w:val="22"/>
+          <w:szCs w:val="22"/>
+        </w:rPr>
+        <w:t>invidunt</w:t>
+      </w:r>
+      <w:proofErr w:type="spellEnd"/>
+      <w:r>
+        <w:rPr>
+          <w:rFonts w:ascii="Arial" w:hAnsi="Arial" w:cs="Arial"/>
+          <w:sz w:val="22"/>
+          <w:szCs w:val="22"/>
+        </w:rPr>
+        <w:t xml:space="preserve"> </w:t>
+      </w:r>
+      <w:proofErr w:type="spellStart"/>
+      <w:r>
+        <w:rPr>
+          <w:rFonts w:ascii="Arial" w:hAnsi="Arial" w:cs="Arial"/>
+          <w:sz w:val="22"/>
+          <w:szCs w:val="22"/>
+        </w:rPr>
+        <w:t>ut</w:t>
+      </w:r>
+      <w:proofErr w:type="spellEnd"/>
+      <w:r>
+        <w:rPr>
+          <w:rFonts w:ascii="Arial" w:hAnsi="Arial" w:cs="Arial"/>
+          <w:sz w:val="22"/>
+          <w:szCs w:val="22"/>
+        </w:rPr>
+        <w:t xml:space="preserve"> </w:t>
+      </w:r>
+      <w:proofErr w:type="spellStart"/>
+      <w:r>
+        <w:rPr>
+          <w:rFonts w:ascii="Arial" w:hAnsi="Arial" w:cs="Arial"/>
+          <w:sz w:val="22"/>
+          <w:szCs w:val="22"/>
+        </w:rPr>
+        <w:t>labore</w:t>
+      </w:r>
+      <w:proofErr w:type="spellEnd"/>
+      <w:r>
+        <w:rPr>
+          <w:rFonts w:ascii="Arial" w:hAnsi="Arial" w:cs="Arial"/>
+          <w:sz w:val="22"/>
+          <w:szCs w:val="22"/>
+        </w:rPr>
+        <w:t xml:space="preserve"> et </w:t>
+      </w:r>
+      <w:proofErr w:type="spellStart"/>
+      <w:r>
+        <w:rPr>
+          <w:rFonts w:ascii="Arial" w:hAnsi="Arial" w:cs="Arial"/>
+          <w:sz w:val="22"/>
+          <w:szCs w:val="22"/>
+        </w:rPr>
+        <w:t>dolore</w:t>
+      </w:r>
+      <w:proofErr w:type="spellEnd"/>
+      <w:r>
+        <w:rPr>
+          <w:rFonts w:ascii="Arial" w:hAnsi="Arial" w:cs="Arial"/>
+          <w:sz w:val="22"/>
+          <w:szCs w:val="22"/>
+        </w:rPr>
+        <w:t xml:space="preserve"> magna </w:t>
+      </w:r>
+      <w:proofErr w:type="spellStart"/>
+      <w:r>
+        <w:rPr>
+          <w:rFonts w:ascii="Arial" w:hAnsi="Arial" w:cs="Arial"/>
+          <w:sz w:val="22"/>
+          <w:szCs w:val="22"/>
+        </w:rPr>
+        <w:t>aliquyam</w:t>
+      </w:r>
+      <w:proofErr w:type="spellEnd"/>
+      <w:r>
+        <w:rPr>
+          <w:rFonts w:ascii="Arial" w:hAnsi="Arial" w:cs="Arial"/>
+          <w:sz w:val="22"/>
+          <w:szCs w:val="22"/>
+        </w:rPr>
+        <w:t xml:space="preserve"> erat, sed </w:t>
+      </w:r>
+      <w:proofErr w:type="spellStart"/>
+      <w:r>
+        <w:rPr>
+          <w:rFonts w:ascii="Arial" w:hAnsi="Arial" w:cs="Arial"/>
+          <w:sz w:val="22"/>
+          <w:szCs w:val="22"/>
+        </w:rPr>
+        <w:t>diam</w:t>
+      </w:r>
+      <w:proofErr w:type="spellEnd"/>
+      <w:r>
+        <w:rPr>
+          <w:rFonts w:ascii="Arial" w:hAnsi="Arial" w:cs="Arial"/>
+          <w:sz w:val="22"/>
+          <w:szCs w:val="22"/>
+        </w:rPr>
+        <w:t xml:space="preserve"> </w:t>
+      </w:r>
+      <w:proofErr w:type="spellStart"/>
+      <w:r>
+        <w:rPr>
+          <w:rFonts w:ascii="Arial" w:hAnsi="Arial" w:cs="Arial"/>
+          <w:sz w:val="22"/>
+          <w:szCs w:val="22"/>
+        </w:rPr>
+        <w:t>voluptua</w:t>
+      </w:r>
+      <w:proofErr w:type="spellEnd"/>
+      <w:r>
+        <w:rPr>
+          <w:rFonts w:ascii="Arial" w:hAnsi="Arial" w:cs="Arial"/>
+          <w:sz w:val="22"/>
+          <w:szCs w:val="22"/>
+        </w:rPr>
+        <w:t xml:space="preserve">. At </w:t>
+      </w:r>
+      <w:proofErr w:type="spellStart"/>
+      <w:r>
+        <w:rPr>
+          <w:rFonts w:ascii="Arial" w:hAnsi="Arial" w:cs="Arial"/>
+          <w:sz w:val="22"/>
+          <w:szCs w:val="22"/>
+        </w:rPr>
+        <w:t>vero</w:t>
+      </w:r>
+      <w:proofErr w:type="spellEnd"/>
+      <w:r>
+        <w:rPr>
+          <w:rFonts w:ascii="Arial" w:hAnsi="Arial" w:cs="Arial"/>
+          <w:sz w:val="22"/>
+          <w:szCs w:val="22"/>
+        </w:rPr>
+        <w:t xml:space="preserve"> </w:t>
+      </w:r>
+      <w:proofErr w:type="spellStart"/>
+      <w:r>
+        <w:rPr>
+          <w:rFonts w:ascii="Arial" w:hAnsi="Arial" w:cs="Arial"/>
+          <w:sz w:val="22"/>
+          <w:szCs w:val="22"/>
+        </w:rPr>
+        <w:t>eos</w:t>
+      </w:r>
+      <w:proofErr w:type="spellEnd"/>
+      <w:r>
+        <w:rPr>
+          <w:rFonts w:ascii="Arial" w:hAnsi="Arial" w:cs="Arial"/>
+          <w:sz w:val="22"/>
+          <w:szCs w:val="22"/>
+        </w:rPr>
+        <w:t xml:space="preserve"> et </w:t>
+      </w:r>
+      <w:proofErr w:type="spellStart"/>
+      <w:r>
+        <w:rPr>
+          <w:rFonts w:ascii="Arial" w:hAnsi="Arial" w:cs="Arial"/>
+          <w:sz w:val="22"/>
+          <w:szCs w:val="22"/>
+        </w:rPr>
+        <w:t>accusam</w:t>
+      </w:r>
+      <w:proofErr w:type="spellEnd"/>
+      <w:r>
+        <w:rPr>
+          <w:rFonts w:ascii="Arial" w:hAnsi="Arial" w:cs="Arial"/>
+          <w:sz w:val="22"/>
+          <w:szCs w:val="22"/>
+        </w:rPr>
+        <w:t xml:space="preserve"> et </w:t>
+      </w:r>
+      <w:proofErr w:type="spellStart"/>
+      <w:r>
+        <w:rPr>
+          <w:rFonts w:ascii="Arial" w:hAnsi="Arial" w:cs="Arial"/>
+          <w:sz w:val="22"/>
+          <w:szCs w:val="22"/>
+        </w:rPr>
+        <w:t>justo</w:t>
+      </w:r>
+      <w:proofErr w:type="spellEnd"/>
+      <w:r>
+        <w:rPr>
+          <w:rFonts w:ascii="Arial" w:hAnsi="Arial" w:cs="Arial"/>
+          <w:sz w:val="22"/>
+          <w:szCs w:val="22"/>
+        </w:rPr>
+        <w:t xml:space="preserve"> </w:t>
+      </w:r>
+      <w:proofErr w:type="spellStart"/>
+      <w:r>
+        <w:rPr>
+          <w:rFonts w:ascii="Arial" w:hAnsi="Arial" w:cs="Arial"/>
+          <w:sz w:val="22"/>
+          <w:szCs w:val="22"/>
+        </w:rPr>
+        <w:t>duo</w:t>
+      </w:r>
+      <w:proofErr w:type="spellEnd"/>
+      <w:r>
+        <w:rPr>
+          <w:rFonts w:ascii="Arial" w:hAnsi="Arial" w:cs="Arial"/>
+          <w:sz w:val="22"/>
+          <w:szCs w:val="22"/>
+        </w:rPr>
+        <w:t xml:space="preserve"> </w:t>
+      </w:r>
+      <w:proofErr w:type="spellStart"/>
+      <w:r>
+        <w:rPr>
+          <w:rFonts w:ascii="Arial" w:hAnsi="Arial" w:cs="Arial"/>
+          <w:sz w:val="22"/>
+          <w:szCs w:val="22"/>
+        </w:rPr>
+        <w:t>dolores</w:t>
+      </w:r>
+      <w:proofErr w:type="spellEnd"/>
+      <w:r>
+        <w:rPr>
+          <w:rFonts w:ascii="Arial" w:hAnsi="Arial" w:cs="Arial"/>
+          <w:sz w:val="22"/>
+          <w:szCs w:val="22"/>
+        </w:rPr>
+        <w:t xml:space="preserve"> et </w:t>
+      </w:r>
+      <w:proofErr w:type="spellStart"/>
+      <w:r>
+        <w:rPr>
+          <w:rFonts w:ascii="Arial" w:hAnsi="Arial" w:cs="Arial"/>
+          <w:sz w:val="22"/>
+          <w:szCs w:val="22"/>
+        </w:rPr>
+        <w:t>ea</w:t>
+      </w:r>
+      <w:proofErr w:type="spellEnd"/>
+      <w:r>
+        <w:rPr>
+          <w:rFonts w:ascii="Arial" w:hAnsi="Arial" w:cs="Arial"/>
+          <w:sz w:val="22"/>
+          <w:szCs w:val="22"/>
+        </w:rPr>
+        <w:t xml:space="preserve"> </w:t>
+      </w:r>
+      <w:proofErr w:type="spellStart"/>
+      <w:r>
+        <w:rPr>
+          <w:rFonts w:ascii="Arial" w:hAnsi="Arial" w:cs="Arial"/>
+          <w:sz w:val="22"/>
+          <w:szCs w:val="22"/>
+        </w:rPr>
+        <w:t>rebum</w:t>
+      </w:r>
+      <w:proofErr w:type="spellEnd"/>
+      <w:r>
+        <w:rPr>
+          <w:rFonts w:ascii="Arial" w:hAnsi="Arial" w:cs="Arial"/>
+          <w:sz w:val="22"/>
+          <w:szCs w:val="22"/>
+        </w:rPr>
+        <w:t xml:space="preserve">. Stet </w:t>
+      </w:r>
+      <w:proofErr w:type="spellStart"/>
+      <w:r>
+        <w:rPr>
+          <w:rFonts w:ascii="Arial" w:hAnsi="Arial" w:cs="Arial"/>
+          <w:sz w:val="22"/>
+          <w:szCs w:val="22"/>
+        </w:rPr>
+        <w:t>clita</w:t>
+      </w:r>
+      <w:proofErr w:type="spellEnd"/>
+      <w:r>
+        <w:rPr>
+          <w:rFonts w:ascii="Arial" w:hAnsi="Arial" w:cs="Arial"/>
+          <w:sz w:val="22"/>
+          <w:szCs w:val="22"/>
+        </w:rPr>
+        <w:t xml:space="preserve"> </w:t>
+      </w:r>
+      <w:proofErr w:type="spellStart"/>
+      <w:r>
+        <w:rPr>
+          <w:rFonts w:ascii="Arial" w:hAnsi="Arial" w:cs="Arial"/>
+          <w:sz w:val="22"/>
+          <w:szCs w:val="22"/>
+        </w:rPr>
+        <w:t>kasd</w:t>
+      </w:r>
+      <w:proofErr w:type="spellEnd"/>
+      <w:r>
+        <w:rPr>
+          <w:rFonts w:ascii="Arial" w:hAnsi="Arial" w:cs="Arial"/>
+          <w:sz w:val="22"/>
+          <w:szCs w:val="22"/>
+        </w:rPr>
+        <w:t xml:space="preserve"> </w:t>
+      </w:r>
+      <w:proofErr w:type="spellStart"/>
+      <w:r>
+        <w:rPr>
+          <w:rFonts w:ascii="Arial" w:hAnsi="Arial" w:cs="Arial"/>
+          <w:sz w:val="22"/>
+          <w:szCs w:val="22"/>
+        </w:rPr>
+        <w:t>gubergren</w:t>
+      </w:r>
+      <w:proofErr w:type="spellEnd"/>
+      <w:r>
+        <w:rPr>
+          <w:rFonts w:ascii="Arial" w:hAnsi="Arial" w:cs="Arial"/>
+          <w:sz w:val="22"/>
+          <w:szCs w:val="22"/>
+        </w:rPr>
+        <w:t xml:space="preserve">, </w:t>
+      </w:r>
+      <w:proofErr w:type="spellStart"/>
+      <w:r>
+        <w:rPr>
+          <w:rFonts w:ascii="Arial" w:hAnsi="Arial" w:cs="Arial"/>
+          <w:sz w:val="22"/>
+          <w:szCs w:val="22"/>
+        </w:rPr>
+        <w:t>no</w:t>
+      </w:r>
+      <w:proofErr w:type="spellEnd"/>
+      <w:r>
+        <w:rPr>
+          <w:rFonts w:ascii="Arial" w:hAnsi="Arial" w:cs="Arial"/>
+          <w:sz w:val="22"/>
+          <w:szCs w:val="22"/>
+        </w:rPr>
+        <w:t xml:space="preserve"> </w:t>
+      </w:r>
+      <w:proofErr w:type="spellStart"/>
+      <w:r>
+        <w:rPr>
+          <w:rFonts w:ascii="Arial" w:hAnsi="Arial" w:cs="Arial"/>
+          <w:sz w:val="22"/>
+          <w:szCs w:val="22"/>
+        </w:rPr>
+        <w:t>sea</w:t>
+      </w:r>
+      <w:proofErr w:type="spellEnd"/>
+      <w:r>
+        <w:rPr>
+          <w:rFonts w:ascii="Arial" w:hAnsi="Arial" w:cs="Arial"/>
+          <w:sz w:val="22"/>
+          <w:szCs w:val="22"/>
+        </w:rPr>
+        <w:t xml:space="preserve"> </w:t>
+      </w:r>
+      <w:proofErr w:type="spellStart"/>
+      <w:r>
+        <w:rPr>
+          <w:rFonts w:ascii="Arial" w:hAnsi="Arial" w:cs="Arial"/>
+          <w:sz w:val="22"/>
+          <w:szCs w:val="22"/>
+        </w:rPr>
+        <w:t>takimata</w:t>
+      </w:r>
+      <w:proofErr w:type="spellEnd"/>
+      <w:r>
+        <w:rPr>
+          <w:rFonts w:ascii="Arial" w:hAnsi="Arial" w:cs="Arial"/>
+          <w:sz w:val="22"/>
+          <w:szCs w:val="22"/>
+        </w:rPr>
+        <w:t xml:space="preserve"> sanctus </w:t>
+      </w:r>
+      <w:proofErr w:type="spellStart"/>
+      <w:r>
+        <w:rPr>
+          <w:rFonts w:ascii="Arial" w:hAnsi="Arial" w:cs="Arial"/>
+          <w:sz w:val="22"/>
+          <w:szCs w:val="22"/>
+        </w:rPr>
+        <w:t>est</w:t>
+      </w:r>
+      <w:proofErr w:type="spellEnd"/>
+      <w:r>
+        <w:rPr>
+          <w:rFonts w:ascii="Arial" w:hAnsi="Arial" w:cs="Arial"/>
+          <w:sz w:val="22"/>
+          <w:szCs w:val="22"/>
+        </w:rPr>
+        <w:t xml:space="preserve"> </w:t>
+      </w:r>
+      <w:proofErr w:type="spellStart"/>
+      <w:r>
+        <w:rPr>
+          <w:rFonts w:ascii="Arial" w:hAnsi="Arial" w:cs="Arial"/>
+          <w:sz w:val="22"/>
+          <w:szCs w:val="22"/>
+        </w:rPr>
+        <w:t>Lorem</w:t>
+      </w:r>
+      <w:proofErr w:type="spellEnd"/>
+      <w:r>
+        <w:rPr>
+          <w:rFonts w:ascii="Arial" w:hAnsi="Arial" w:cs="Arial"/>
+          <w:sz w:val="22"/>
+          <w:szCs w:val="22"/>
+        </w:rPr>
+        <w:t xml:space="preserve"> </w:t>
+      </w:r>
+      <w:proofErr w:type="spellStart"/>
+      <w:r>
+        <w:rPr>
+          <w:rFonts w:ascii="Arial" w:hAnsi="Arial" w:cs="Arial"/>
+          <w:sz w:val="22"/>
+          <w:szCs w:val="22"/>
+        </w:rPr>
+        <w:t>ipsum</w:t>
+      </w:r>
+      <w:proofErr w:type="spellEnd"/>
+      <w:r>
+        <w:rPr>
+          <w:rFonts w:ascii="Arial" w:hAnsi="Arial" w:cs="Arial"/>
+          <w:sz w:val="22"/>
+          <w:szCs w:val="22"/>
+        </w:rPr>
+        <w:t xml:space="preserve"> </w:t>
+      </w:r>
+      <w:proofErr w:type="spellStart"/>
+      <w:r>
+        <w:rPr>
+          <w:rFonts w:ascii="Arial" w:hAnsi="Arial" w:cs="Arial"/>
+          <w:sz w:val="22"/>
+          <w:szCs w:val="22"/>
+        </w:rPr>
+        <w:t>dolor</w:t>
+      </w:r>
+      <w:proofErr w:type="spellEnd"/>
+      <w:r>
+        <w:rPr>
+          <w:rFonts w:ascii="Arial" w:hAnsi="Arial" w:cs="Arial"/>
+          <w:sz w:val="22"/>
+          <w:szCs w:val="22"/>
+        </w:rPr>
+        <w:t xml:space="preserve"> </w:t>
+      </w:r>
+      <w:proofErr w:type="spellStart"/>
+      <w:r>
+        <w:rPr>
+          <w:rFonts w:ascii="Arial" w:hAnsi="Arial" w:cs="Arial"/>
+          <w:sz w:val="22"/>
+          <w:szCs w:val="22"/>
+        </w:rPr>
+        <w:t>sit</w:t>
+      </w:r>
+      <w:proofErr w:type="spellEnd"/>
+      <w:r>
+        <w:rPr>
+          <w:rFonts w:ascii="Arial" w:hAnsi="Arial" w:cs="Arial"/>
+          <w:sz w:val="22"/>
+          <w:szCs w:val="22"/>
+        </w:rPr>
+        <w:t xml:space="preserve"> </w:t>
+      </w:r>
+      <w:proofErr w:type="spellStart"/>
+      <w:r>
+        <w:rPr>
+          <w:rFonts w:ascii="Arial" w:hAnsi="Arial" w:cs="Arial"/>
+          <w:sz w:val="22"/>
+          <w:szCs w:val="22"/>
+        </w:rPr>
+        <w:t>amet</w:t>
+      </w:r>
+      <w:proofErr w:type="spellEnd"/>
+      <w:r>
+        <w:rPr>
+          <w:rFonts w:ascii="Arial" w:hAnsi="Arial" w:cs="Arial"/>
+          <w:sz w:val="22"/>
+          <w:szCs w:val="22"/>
+        </w:rPr>
+        <w:t xml:space="preserve">. </w:t>
+      </w:r>
+      <w:proofErr w:type="spellStart"/>
+      <w:r>
+        <w:rPr>
+          <w:rFonts w:ascii="Arial" w:hAnsi="Arial" w:cs="Arial"/>
+          <w:sz w:val="22"/>
+          <w:szCs w:val="22"/>
+        </w:rPr>
+        <w:t>Lorem</w:t>
+      </w:r>
+      <w:proofErr w:type="spellEnd"/>
+      <w:r>
+        <w:rPr>
+          <w:rFonts w:ascii="Arial" w:hAnsi="Arial" w:cs="Arial"/>
+          <w:sz w:val="22"/>
+          <w:szCs w:val="22"/>
+        </w:rPr>
+        <w:t xml:space="preserve"> </w:t>
+      </w:r>
+      <w:proofErr w:type="spellStart"/>
+      <w:r>
+        <w:rPr>
+          <w:rFonts w:ascii="Arial" w:hAnsi="Arial" w:cs="Arial"/>
+          <w:sz w:val="22"/>
+          <w:szCs w:val="22"/>
+        </w:rPr>
+        <w:t>ipsum</w:t>
+      </w:r>
+      <w:proofErr w:type="spellEnd"/>
+      <w:r>
+        <w:rPr>
+          <w:rFonts w:ascii="Arial" w:hAnsi="Arial" w:cs="Arial"/>
+          <w:sz w:val="22"/>
+          <w:szCs w:val="22"/>
+        </w:rPr>
+        <w:t xml:space="preserve"> </w:t>
+      </w:r>
+      <w:proofErr w:type="spellStart"/>
+      <w:r>
+        <w:rPr>
+          <w:rFonts w:ascii="Arial" w:hAnsi="Arial" w:cs="Arial"/>
+          <w:sz w:val="22"/>
+          <w:szCs w:val="22"/>
+        </w:rPr>
+        <w:t>dolor</w:t>
+      </w:r>
+      <w:proofErr w:type="spellEnd"/>
+      <w:r>
+        <w:rPr>
+          <w:rFonts w:ascii="Arial" w:hAnsi="Arial" w:cs="Arial"/>
+          <w:sz w:val="22"/>
+          <w:szCs w:val="22"/>
+        </w:rPr>
+        <w:t xml:space="preserve"> </w:t>
+      </w:r>
+      <w:proofErr w:type="spellStart"/>
+      <w:r>
+        <w:rPr>
+          <w:rFonts w:ascii="Arial" w:hAnsi="Arial" w:cs="Arial"/>
+          <w:sz w:val="22"/>
+          <w:szCs w:val="22"/>
+        </w:rPr>
+        <w:t>sit</w:t>
+      </w:r>
+      <w:proofErr w:type="spellEnd"/>
+      <w:r>
+        <w:rPr>
+          <w:rFonts w:ascii="Arial" w:hAnsi="Arial" w:cs="Arial"/>
+          <w:sz w:val="22"/>
+          <w:szCs w:val="22"/>
+        </w:rPr>
+        <w:t xml:space="preserve"> </w:t>
+      </w:r>
+      <w:proofErr w:type="spellStart"/>
+      <w:r>
+        <w:rPr>
+          <w:rFonts w:ascii="Arial" w:hAnsi="Arial" w:cs="Arial"/>
+          <w:sz w:val="22"/>
+          <w:szCs w:val="22"/>
+        </w:rPr>
+        <w:t>amet</w:t>
+      </w:r>
+      <w:proofErr w:type="spellEnd"/>
+      <w:r>
+        <w:rPr>
+          <w:rFonts w:ascii="Arial" w:hAnsi="Arial" w:cs="Arial"/>
+          <w:sz w:val="22"/>
+          <w:szCs w:val="22"/>
+        </w:rPr>
+        <w:t xml:space="preserve">, </w:t>
+      </w:r>
+      <w:proofErr w:type="spellStart"/>
+      <w:r>
+        <w:rPr>
+          <w:rFonts w:ascii="Arial" w:hAnsi="Arial" w:cs="Arial"/>
+          <w:sz w:val="22"/>
+          <w:szCs w:val="22"/>
+        </w:rPr>
+        <w:t>consetetur</w:t>
+      </w:r>
+      <w:proofErr w:type="spellEnd"/>
+      <w:r>
+        <w:rPr>
+          <w:rFonts w:ascii="Arial" w:hAnsi="Arial" w:cs="Arial"/>
+          <w:sz w:val="22"/>
+          <w:szCs w:val="22"/>
+        </w:rPr>
+        <w:t xml:space="preserve"> </w:t>
+      </w:r>
+      <w:proofErr w:type="spellStart"/>
+      <w:r>
+        <w:rPr>
+          <w:rFonts w:ascii="Arial" w:hAnsi="Arial" w:cs="Arial"/>
+          <w:sz w:val="22"/>
+          <w:szCs w:val="22"/>
+        </w:rPr>
+        <w:t>sadipscing</w:t>
+      </w:r>
+      <w:proofErr w:type="spellEnd"/>
+      <w:r>
+        <w:rPr>
+          <w:rFonts w:ascii="Arial" w:hAnsi="Arial" w:cs="Arial"/>
+          <w:sz w:val="22"/>
+          <w:szCs w:val="22"/>
+        </w:rPr>
+        <w:t xml:space="preserve"> </w:t>
+      </w:r>
+      <w:proofErr w:type="spellStart"/>
+      <w:r>
+        <w:rPr>
+          <w:rFonts w:ascii="Arial" w:hAnsi="Arial" w:cs="Arial"/>
+          <w:sz w:val="22"/>
+          <w:szCs w:val="22"/>
+        </w:rPr>
+        <w:t>elitr</w:t>
+      </w:r>
+      <w:proofErr w:type="spellEnd"/>
+      <w:r>
+        <w:rPr>
+          <w:rFonts w:ascii="Arial" w:hAnsi="Arial" w:cs="Arial"/>
+          <w:sz w:val="22"/>
+          <w:szCs w:val="22"/>
+        </w:rPr>
+        <w:t xml:space="preserve">, sed </w:t>
+      </w:r>
+      <w:proofErr w:type="spellStart"/>
+      <w:r>
+        <w:rPr>
+          <w:rFonts w:ascii="Arial" w:hAnsi="Arial" w:cs="Arial"/>
+          <w:sz w:val="22"/>
+          <w:szCs w:val="22"/>
+        </w:rPr>
+        <w:t>diam</w:t>
+      </w:r>
+      <w:proofErr w:type="spellEnd"/>
+      <w:r>
+        <w:rPr>
+          <w:rFonts w:ascii="Arial" w:hAnsi="Arial" w:cs="Arial"/>
+          <w:sz w:val="22"/>
+          <w:szCs w:val="22"/>
+        </w:rPr>
+        <w:t xml:space="preserve"> </w:t>
+      </w:r>
+      <w:proofErr w:type="spellStart"/>
+      <w:r>
+        <w:rPr>
+          <w:rFonts w:ascii="Arial" w:hAnsi="Arial" w:cs="Arial"/>
+          <w:sz w:val="22"/>
+          <w:szCs w:val="22"/>
+        </w:rPr>
+        <w:t>nonumy</w:t>
+      </w:r>
+      <w:proofErr w:type="spellEnd"/>
+      <w:r>
+        <w:rPr>
+          <w:rFonts w:ascii="Arial" w:hAnsi="Arial" w:cs="Arial"/>
+          <w:sz w:val="22"/>
+          <w:szCs w:val="22"/>
+        </w:rPr>
+        <w:t xml:space="preserve"> </w:t>
+      </w:r>
+      <w:proofErr w:type="spellStart"/>
+      <w:r>
+        <w:rPr>
+          <w:rFonts w:ascii="Arial" w:hAnsi="Arial" w:cs="Arial"/>
+          <w:sz w:val="22"/>
+          <w:szCs w:val="22"/>
+        </w:rPr>
+        <w:t>eirmod</w:t>
+      </w:r>
+      <w:proofErr w:type="spellEnd"/>
+      <w:r>
+        <w:rPr>
+          <w:rFonts w:ascii="Arial" w:hAnsi="Arial" w:cs="Arial"/>
+          <w:sz w:val="22"/>
+          <w:szCs w:val="22"/>
+        </w:rPr>
+        <w:t xml:space="preserve"> </w:t>
+      </w:r>
+      <w:proofErr w:type="spellStart"/>
+      <w:r>
+        <w:rPr>
+          <w:rFonts w:ascii="Arial" w:hAnsi="Arial" w:cs="Arial"/>
+          <w:sz w:val="22"/>
+          <w:szCs w:val="22"/>
+        </w:rPr>
+        <w:t>tempor</w:t>
+      </w:r>
+      <w:proofErr w:type="spellEnd"/>
+      <w:r>
+        <w:rPr>
+          <w:rFonts w:ascii="Arial" w:hAnsi="Arial" w:cs="Arial"/>
+          <w:sz w:val="22"/>
+          <w:szCs w:val="22"/>
+        </w:rPr>
+        <w:t xml:space="preserve"> </w:t>
+      </w:r>
+      <w:proofErr w:type="spellStart"/>
+      <w:r>
+        <w:rPr>
+          <w:rFonts w:ascii="Arial" w:hAnsi="Arial" w:cs="Arial"/>
+          <w:sz w:val="22"/>
+          <w:szCs w:val="22"/>
+        </w:rPr>
+        <w:t>invidunt</w:t>
+      </w:r>
+      <w:proofErr w:type="spellEnd"/>
+      <w:r>
+        <w:rPr>
+          <w:rFonts w:ascii="Arial" w:hAnsi="Arial" w:cs="Arial"/>
+          <w:sz w:val="22"/>
+          <w:szCs w:val="22"/>
+        </w:rPr>
+        <w:t xml:space="preserve"> </w:t>
+      </w:r>
+      <w:proofErr w:type="spellStart"/>
+      <w:r>
+        <w:rPr>
+          <w:rFonts w:ascii="Arial" w:hAnsi="Arial" w:cs="Arial"/>
+          <w:sz w:val="22"/>
+          <w:szCs w:val="22"/>
+        </w:rPr>
+        <w:t>ut</w:t>
+      </w:r>
+      <w:proofErr w:type="spellEnd"/>
+      <w:r>
+        <w:rPr>
+          <w:rFonts w:ascii="Arial" w:hAnsi="Arial" w:cs="Arial"/>
+          <w:sz w:val="22"/>
+          <w:szCs w:val="22"/>
+        </w:rPr>
+        <w:t xml:space="preserve"> </w:t>
+      </w:r>
+      <w:proofErr w:type="spellStart"/>
+      <w:r>
+        <w:rPr>
+          <w:rFonts w:ascii="Arial" w:hAnsi="Arial" w:cs="Arial"/>
+          <w:sz w:val="22"/>
+          <w:szCs w:val="22"/>
+        </w:rPr>
+        <w:t>labore</w:t>
+      </w:r>
+      <w:proofErr w:type="spellEnd"/>
+      <w:r>
+        <w:rPr>
+          <w:rFonts w:ascii="Arial" w:hAnsi="Arial" w:cs="Arial"/>
+          <w:sz w:val="22"/>
+          <w:szCs w:val="22"/>
+        </w:rPr>
+        <w:t xml:space="preserve"> et </w:t>
+      </w:r>
+      <w:proofErr w:type="spellStart"/>
+      <w:r>
+        <w:rPr>
+          <w:rFonts w:ascii="Arial" w:hAnsi="Arial" w:cs="Arial"/>
+          <w:sz w:val="22"/>
+          <w:szCs w:val="22"/>
+        </w:rPr>
+        <w:t>dolore</w:t>
+      </w:r>
+      <w:proofErr w:type="spellEnd"/>
+      <w:r>
+        <w:rPr>
+          <w:rFonts w:ascii="Arial" w:hAnsi="Arial" w:cs="Arial"/>
+          <w:sz w:val="22"/>
+          <w:szCs w:val="22"/>
+        </w:rPr>
+        <w:t xml:space="preserve"> magna </w:t>
+      </w:r>
+      <w:proofErr w:type="spellStart"/>
+      <w:r>
+        <w:rPr>
+          <w:rFonts w:ascii="Arial" w:hAnsi="Arial" w:cs="Arial"/>
+          <w:sz w:val="22"/>
+          <w:szCs w:val="22"/>
+        </w:rPr>
+        <w:t>aliquyam</w:t>
+      </w:r>
+      <w:proofErr w:type="spellEnd"/>
+      <w:r>
+        <w:rPr>
+          <w:rFonts w:ascii="Arial" w:hAnsi="Arial" w:cs="Arial"/>
+          <w:sz w:val="22"/>
+          <w:szCs w:val="22"/>
+        </w:rPr>
+        <w:t xml:space="preserve"> erat, sed </w:t>
+      </w:r>
+      <w:proofErr w:type="spellStart"/>
+      <w:r>
+        <w:rPr>
+          <w:rFonts w:ascii="Arial" w:hAnsi="Arial" w:cs="Arial"/>
+          <w:sz w:val="22"/>
+          <w:szCs w:val="22"/>
+        </w:rPr>
+        <w:t>diam</w:t>
+      </w:r>
+      <w:proofErr w:type="spellEnd"/>
+      <w:r>
+        <w:rPr>
+          <w:rFonts w:ascii="Arial" w:hAnsi="Arial" w:cs="Arial"/>
+          <w:sz w:val="22"/>
+          <w:szCs w:val="22"/>
+        </w:rPr>
+        <w:t xml:space="preserve"> </w:t>
+      </w:r>
+      <w:proofErr w:type="spellStart"/>
+      <w:r>
+        <w:rPr>
+          <w:rFonts w:ascii="Arial" w:hAnsi="Arial" w:cs="Arial"/>
+          <w:sz w:val="22"/>
+          <w:szCs w:val="22"/>
+        </w:rPr>
+        <w:t>voluptua</w:t>
+      </w:r>
+      <w:proofErr w:type="spellEnd"/>
+      <w:r>
+        <w:rPr>
+          <w:rFonts w:ascii="Arial" w:hAnsi="Arial" w:cs="Arial"/>
+          <w:sz w:val="22"/>
+          <w:szCs w:val="22"/>
+        </w:rPr>
+        <w:t xml:space="preserve">. At </w:t>
+      </w:r>
+      <w:proofErr w:type="spellStart"/>
+      <w:r>
+        <w:rPr>
+          <w:rFonts w:ascii="Arial" w:hAnsi="Arial" w:cs="Arial"/>
+          <w:sz w:val="22"/>
+          <w:szCs w:val="22"/>
+        </w:rPr>
+        <w:t>vero</w:t>
+      </w:r>
+      <w:proofErr w:type="spellEnd"/>
+      <w:r>
+        <w:rPr>
+          <w:rFonts w:ascii="Arial" w:hAnsi="Arial" w:cs="Arial"/>
+          <w:sz w:val="22"/>
+          <w:szCs w:val="22"/>
+        </w:rPr>
+        <w:t xml:space="preserve"> </w:t>
+      </w:r>
+      <w:proofErr w:type="spellStart"/>
+      <w:r>
+        <w:rPr>
+          <w:rFonts w:ascii="Arial" w:hAnsi="Arial" w:cs="Arial"/>
+          <w:sz w:val="22"/>
+          <w:szCs w:val="22"/>
+        </w:rPr>
+        <w:t>eos</w:t>
+      </w:r>
+      <w:proofErr w:type="spellEnd"/>
+      <w:r>
+        <w:rPr>
+          <w:rFonts w:ascii="Arial" w:hAnsi="Arial" w:cs="Arial"/>
+          <w:sz w:val="22"/>
+          <w:szCs w:val="22"/>
+        </w:rPr>
+        <w:t xml:space="preserve"> et </w:t>
+      </w:r>
+      <w:proofErr w:type="spellStart"/>
+      <w:r>
+        <w:rPr>
+          <w:rFonts w:ascii="Arial" w:hAnsi="Arial" w:cs="Arial"/>
+          <w:sz w:val="22"/>
+          <w:szCs w:val="22"/>
+        </w:rPr>
+        <w:t>accusam</w:t>
+      </w:r>
+      <w:proofErr w:type="spellEnd"/>
+      <w:r>
+        <w:rPr>
+          <w:rFonts w:ascii="Arial" w:hAnsi="Arial" w:cs="Arial"/>
+          <w:sz w:val="22"/>
+          <w:szCs w:val="22"/>
+        </w:rPr>
+        <w:t xml:space="preserve"> et </w:t>
+      </w:r>
+      <w:proofErr w:type="spellStart"/>
+      <w:r>
+        <w:rPr>
+          <w:rFonts w:ascii="Arial" w:hAnsi="Arial" w:cs="Arial"/>
+          <w:sz w:val="22"/>
+          <w:szCs w:val="22"/>
+        </w:rPr>
+        <w:t>justo</w:t>
+      </w:r>
+      <w:proofErr w:type="spellEnd"/>
+      <w:r>
+        <w:rPr>
+          <w:rFonts w:ascii="Arial" w:hAnsi="Arial" w:cs="Arial"/>
+          <w:sz w:val="22"/>
+          <w:szCs w:val="22"/>
+        </w:rPr>
+        <w:t xml:space="preserve"> </w:t>
+      </w:r>
+      <w:proofErr w:type="spellStart"/>
+      <w:r>
+        <w:rPr>
+          <w:rFonts w:ascii="Arial" w:hAnsi="Arial" w:cs="Arial"/>
+          <w:sz w:val="22"/>
+          <w:szCs w:val="22"/>
+        </w:rPr>
+        <w:t>duo</w:t>
+      </w:r>
+      <w:proofErr w:type="spellEnd"/>
+      <w:r>
+        <w:rPr>
+          <w:rFonts w:ascii="Arial" w:hAnsi="Arial" w:cs="Arial"/>
+          <w:sz w:val="22"/>
+          <w:szCs w:val="22"/>
+        </w:rPr>
+        <w:t xml:space="preserve"> </w:t>
+      </w:r>
+      <w:proofErr w:type="spellStart"/>
+      <w:r>
+        <w:rPr>
+          <w:rFonts w:ascii="Arial" w:hAnsi="Arial" w:cs="Arial"/>
+          <w:sz w:val="22"/>
+          <w:szCs w:val="22"/>
+        </w:rPr>
+        <w:t>dolores</w:t>
+      </w:r>
+      <w:proofErr w:type="spellEnd"/>
+      <w:r>
+        <w:rPr>
+          <w:rFonts w:ascii="Arial" w:hAnsi="Arial" w:cs="Arial"/>
+          <w:sz w:val="22"/>
+          <w:szCs w:val="22"/>
+        </w:rPr>
+        <w:t xml:space="preserve"> et </w:t>
+      </w:r>
+      <w:proofErr w:type="spellStart"/>
+      <w:r>
+        <w:rPr>
+          <w:rFonts w:ascii="Arial" w:hAnsi="Arial" w:cs="Arial"/>
+          <w:sz w:val="22"/>
+          <w:szCs w:val="22"/>
+        </w:rPr>
+        <w:t>ea</w:t>
+      </w:r>
+      <w:proofErr w:type="spellEnd"/>
+      <w:r>
+        <w:rPr>
+          <w:rFonts w:ascii="Arial" w:hAnsi="Arial" w:cs="Arial"/>
+          <w:sz w:val="22"/>
+          <w:szCs w:val="22"/>
+        </w:rPr>
+        <w:t xml:space="preserve"> </w:t>
+      </w:r>
+      <w:proofErr w:type="spellStart"/>
+      <w:r>
+        <w:rPr>
+          <w:rFonts w:ascii="Arial" w:hAnsi="Arial" w:cs="Arial"/>
+          <w:sz w:val="22"/>
+          <w:szCs w:val="22"/>
+        </w:rPr>
+        <w:t>rebum</w:t>
+      </w:r>
+      <w:proofErr w:type="spellEnd"/>
+      <w:r>
+        <w:rPr>
+          <w:rFonts w:ascii="Arial" w:hAnsi="Arial" w:cs="Arial"/>
+          <w:sz w:val="22"/>
+          <w:szCs w:val="22"/>
+        </w:rPr>
+        <w:t xml:space="preserve">. Stet </w:t>
+      </w:r>
+      <w:proofErr w:type="spellStart"/>
+      <w:r>
+        <w:rPr>
+          <w:rFonts w:ascii="Arial" w:hAnsi="Arial" w:cs="Arial"/>
+          <w:sz w:val="22"/>
+          <w:szCs w:val="22"/>
+        </w:rPr>
+        <w:t>clita</w:t>
+      </w:r>
+      <w:proofErr w:type="spellEnd"/>
+      <w:r>
+        <w:rPr>
+          <w:rFonts w:ascii="Arial" w:hAnsi="Arial" w:cs="Arial"/>
+          <w:sz w:val="22"/>
+          <w:szCs w:val="22"/>
+        </w:rPr>
+        <w:t xml:space="preserve"> </w:t>
+      </w:r>
+      <w:proofErr w:type="spellStart"/>
+      <w:r>
+        <w:rPr>
+          <w:rFonts w:ascii="Arial" w:hAnsi="Arial" w:cs="Arial"/>
+          <w:sz w:val="22"/>
+          <w:szCs w:val="22"/>
+        </w:rPr>
+        <w:t>kasd</w:t>
+      </w:r>
+      <w:proofErr w:type="spellEnd"/>
+      <w:r>
+        <w:rPr>
+          <w:rFonts w:ascii="Arial" w:hAnsi="Arial" w:cs="Arial"/>
+          <w:sz w:val="22"/>
+          <w:szCs w:val="22"/>
+        </w:rPr>
+        <w:t xml:space="preserve"> </w:t>
+      </w:r>
+      <w:proofErr w:type="spellStart"/>
+      <w:r>
+        <w:rPr>
+          <w:rFonts w:ascii="Arial" w:hAnsi="Arial" w:cs="Arial"/>
+          <w:sz w:val="22"/>
+          <w:szCs w:val="22"/>
+        </w:rPr>
+        <w:t>gubergren</w:t>
+      </w:r>
+      <w:proofErr w:type="spellEnd"/>
+      <w:r>
+        <w:rPr>
+          <w:rFonts w:ascii="Arial" w:hAnsi="Arial" w:cs="Arial"/>
+          <w:sz w:val="22"/>
+          <w:szCs w:val="22"/>
+        </w:rPr>
+        <w:t xml:space="preserve">, </w:t>
+      </w:r>
+      <w:proofErr w:type="spellStart"/>
+      <w:r>
+        <w:rPr>
+          <w:rFonts w:ascii="Arial" w:hAnsi="Arial" w:cs="Arial"/>
+          <w:sz w:val="22"/>
+          <w:szCs w:val="22"/>
+        </w:rPr>
+        <w:t>no</w:t>
+      </w:r>
+      <w:proofErr w:type="spellEnd"/>
+      <w:r>
+        <w:rPr>
+          <w:rFonts w:ascii="Arial" w:hAnsi="Arial" w:cs="Arial"/>
+          <w:sz w:val="22"/>
+          <w:szCs w:val="22"/>
+        </w:rPr>
+        <w:t xml:space="preserve"> </w:t>
+      </w:r>
+      <w:proofErr w:type="spellStart"/>
+      <w:r>
+        <w:rPr>
+          <w:rFonts w:ascii="Arial" w:hAnsi="Arial" w:cs="Arial"/>
+          <w:sz w:val="22"/>
+          <w:szCs w:val="22"/>
+        </w:rPr>
+        <w:t>sea</w:t>
+      </w:r>
+      <w:proofErr w:type="spellEnd"/>
+      <w:r>
+        <w:rPr>
+          <w:rFonts w:ascii="Arial" w:hAnsi="Arial" w:cs="Arial"/>
+          <w:sz w:val="22"/>
+          <w:szCs w:val="22"/>
+        </w:rPr>
+        <w:t xml:space="preserve"> </w:t>
+      </w:r>
+      <w:proofErr w:type="spellStart"/>
+      <w:r>
+        <w:rPr>
+          <w:rFonts w:ascii="Arial" w:hAnsi="Arial" w:cs="Arial"/>
+          <w:sz w:val="22"/>
+          <w:szCs w:val="22"/>
+        </w:rPr>
+        <w:t>takimata</w:t>
+      </w:r>
+      <w:proofErr w:type="spellEnd"/>
+      <w:r>
+        <w:rPr>
+          <w:rFonts w:ascii="Arial" w:hAnsi="Arial" w:cs="Arial"/>
+          <w:sz w:val="22"/>
+          <w:szCs w:val="22"/>
+        </w:rPr>
+        <w:t xml:space="preserve"> sanctus </w:t>
+      </w:r>
+      <w:proofErr w:type="spellStart"/>
+      <w:r>
+        <w:rPr>
+          <w:rFonts w:ascii="Arial" w:hAnsi="Arial" w:cs="Arial"/>
+          <w:sz w:val="22"/>
+          <w:szCs w:val="22"/>
+        </w:rPr>
+        <w:t>est</w:t>
+      </w:r>
+      <w:proofErr w:type="spellEnd"/>
+      <w:r>
+        <w:rPr>
+          <w:rFonts w:ascii="Arial" w:hAnsi="Arial" w:cs="Arial"/>
+          <w:sz w:val="22"/>
+          <w:szCs w:val="22"/>
+        </w:rPr>
+        <w:t xml:space="preserve"> </w:t>
+      </w:r>
+      <w:proofErr w:type="spellStart"/>
+      <w:r>
+        <w:rPr>
+          <w:rFonts w:ascii="Arial" w:hAnsi="Arial" w:cs="Arial"/>
+          <w:sz w:val="22"/>
+          <w:szCs w:val="22"/>
+        </w:rPr>
+        <w:t>Lorem</w:t>
+      </w:r>
+      <w:proofErr w:type="spellEnd"/>
+      <w:r>
+        <w:rPr>
+          <w:rFonts w:ascii="Arial" w:hAnsi="Arial" w:cs="Arial"/>
+          <w:sz w:val="22"/>
+          <w:szCs w:val="22"/>
+        </w:rPr>
+        <w:t xml:space="preserve"> </w:t>
+      </w:r>
+      <w:proofErr w:type="spellStart"/>
+      <w:r>
+        <w:rPr>
+          <w:rFonts w:ascii="Arial" w:hAnsi="Arial" w:cs="Arial"/>
+          <w:sz w:val="22"/>
+          <w:szCs w:val="22"/>
+        </w:rPr>
+        <w:t>ipsum</w:t>
+      </w:r>
+      <w:proofErr w:type="spellEnd"/>
+      <w:r>
+        <w:rPr>
+          <w:rFonts w:ascii="Arial" w:hAnsi="Arial" w:cs="Arial"/>
+          <w:sz w:val="22"/>
+          <w:szCs w:val="22"/>
+        </w:rPr>
+        <w:t xml:space="preserve"> </w:t>
+      </w:r>
+      <w:proofErr w:type="spellStart"/>
+      <w:r>
+        <w:rPr>
+          <w:rFonts w:ascii="Arial" w:hAnsi="Arial" w:cs="Arial"/>
+          <w:sz w:val="22"/>
+          <w:szCs w:val="22"/>
+        </w:rPr>
+        <w:t>dolor</w:t>
+      </w:r>
+      <w:proofErr w:type="spellEnd"/>
+      <w:r>
+        <w:rPr>
+          <w:rFonts w:ascii="Arial" w:hAnsi="Arial" w:cs="Arial"/>
+          <w:sz w:val="22"/>
+          <w:szCs w:val="22"/>
+        </w:rPr>
+        <w:t xml:space="preserve"> </w:t>
+      </w:r>
+      <w:proofErr w:type="spellStart"/>
+      <w:r>
+        <w:rPr>
+          <w:rFonts w:ascii="Arial" w:hAnsi="Arial" w:cs="Arial"/>
+          <w:sz w:val="22"/>
+          <w:szCs w:val="22"/>
+        </w:rPr>
+        <w:t>sit</w:t>
+      </w:r>
+      <w:proofErr w:type="spellEnd"/>
+      <w:r>
+        <w:rPr>
+          <w:rFonts w:ascii="Arial" w:hAnsi="Arial" w:cs="Arial"/>
+          <w:sz w:val="22"/>
+          <w:szCs w:val="22"/>
+        </w:rPr>
+        <w:t xml:space="preserve"> </w:t>
+      </w:r>
+      <w:proofErr w:type="spellStart"/>
+      <w:r>
+        <w:rPr>
+          <w:rFonts w:ascii="Arial" w:hAnsi="Arial" w:cs="Arial"/>
+          <w:sz w:val="22"/>
+          <w:szCs w:val="22"/>
+        </w:rPr>
+        <w:t>amet</w:t>
+      </w:r>
+      <w:proofErr w:type="spellEnd"/>
+      <w:r>
+        <w:rPr>
+          <w:rFonts w:ascii="Arial" w:hAnsi="Arial" w:cs="Arial"/>
+          <w:sz w:val="22"/>
+          <w:szCs w:val="22"/>
+        </w:rPr>
+        <w:t xml:space="preserve">. Duis </w:t>
+      </w:r>
+      <w:proofErr w:type="spellStart"/>
+      <w:r>
+        <w:rPr>
+          <w:rFonts w:ascii="Arial" w:hAnsi="Arial" w:cs="Arial"/>
+          <w:sz w:val="22"/>
+          <w:szCs w:val="22"/>
+        </w:rPr>
+        <w:t>autem</w:t>
+      </w:r>
+      <w:proofErr w:type="spellEnd"/>
+      <w:r>
+        <w:rPr>
+          <w:rFonts w:ascii="Arial" w:hAnsi="Arial" w:cs="Arial"/>
+          <w:sz w:val="22"/>
+          <w:szCs w:val="22"/>
+        </w:rPr>
+        <w:t xml:space="preserve"> </w:t>
+      </w:r>
+      <w:proofErr w:type="spellStart"/>
+      <w:r>
+        <w:rPr>
+          <w:rFonts w:ascii="Arial" w:hAnsi="Arial" w:cs="Arial"/>
+          <w:sz w:val="22"/>
+          <w:szCs w:val="22"/>
+        </w:rPr>
+        <w:t>vel</w:t>
+      </w:r>
+      <w:proofErr w:type="spellEnd"/>
+      <w:r>
+        <w:rPr>
+          <w:rFonts w:ascii="Arial" w:hAnsi="Arial" w:cs="Arial"/>
+          <w:sz w:val="22"/>
+          <w:szCs w:val="22"/>
+        </w:rPr>
+        <w:t xml:space="preserve"> </w:t>
+      </w:r>
+      <w:proofErr w:type="spellStart"/>
+      <w:r>
+        <w:rPr>
+          <w:rFonts w:ascii="Arial" w:hAnsi="Arial" w:cs="Arial"/>
+          <w:sz w:val="22"/>
+          <w:szCs w:val="22"/>
+        </w:rPr>
+        <w:t>eum</w:t>
+      </w:r>
+      <w:proofErr w:type="spellEnd"/>
+      <w:r>
+        <w:rPr>
+          <w:rFonts w:ascii="Arial" w:hAnsi="Arial" w:cs="Arial"/>
+          <w:sz w:val="22"/>
+          <w:szCs w:val="22"/>
+        </w:rPr>
+        <w:t xml:space="preserve"> </w:t>
+      </w:r>
+      <w:proofErr w:type="spellStart"/>
+      <w:r>
+        <w:rPr>
+          <w:rFonts w:ascii="Arial" w:hAnsi="Arial" w:cs="Arial"/>
+          <w:sz w:val="22"/>
+          <w:szCs w:val="22"/>
+        </w:rPr>
+        <w:t>iriure</w:t>
+      </w:r>
+      <w:proofErr w:type="spellEnd"/>
+      <w:r>
+        <w:rPr>
+          <w:rFonts w:ascii="Arial" w:hAnsi="Arial" w:cs="Arial"/>
+          <w:sz w:val="22"/>
+          <w:szCs w:val="22"/>
+        </w:rPr>
+        <w:t xml:space="preserve"> </w:t>
+      </w:r>
+      <w:proofErr w:type="spellStart"/>
+      <w:r>
+        <w:rPr>
+          <w:rFonts w:ascii="Arial" w:hAnsi="Arial" w:cs="Arial"/>
+          <w:sz w:val="22"/>
+          <w:szCs w:val="22"/>
+        </w:rPr>
+        <w:t>dolor</w:t>
+      </w:r>
+      <w:proofErr w:type="spellEnd"/>
+      <w:r>
+        <w:rPr>
+          <w:rFonts w:ascii="Arial" w:hAnsi="Arial" w:cs="Arial"/>
+          <w:sz w:val="22"/>
+          <w:szCs w:val="22"/>
+        </w:rPr>
+        <w:t xml:space="preserve"> in </w:t>
+      </w:r>
+      <w:proofErr w:type="spellStart"/>
+      <w:r>
+        <w:rPr>
+          <w:rFonts w:ascii="Arial" w:hAnsi="Arial" w:cs="Arial"/>
+          <w:sz w:val="22"/>
+          <w:szCs w:val="22"/>
+        </w:rPr>
+        <w:t>hendrerit</w:t>
+      </w:r>
+      <w:proofErr w:type="spellEnd"/>
+      <w:r>
+        <w:rPr>
+          <w:rFonts w:ascii="Arial" w:hAnsi="Arial" w:cs="Arial"/>
+          <w:sz w:val="22"/>
+          <w:szCs w:val="22"/>
+        </w:rPr>
+        <w:t xml:space="preserve"> in </w:t>
+      </w:r>
+      <w:proofErr w:type="spellStart"/>
+      <w:r>
+        <w:rPr>
+          <w:rFonts w:ascii="Arial" w:hAnsi="Arial" w:cs="Arial"/>
+          <w:sz w:val="22"/>
+          <w:szCs w:val="22"/>
+        </w:rPr>
+        <w:t>vulputate</w:t>
+      </w:r>
+      <w:proofErr w:type="spellEnd"/>
+      <w:r>
+        <w:rPr>
+          <w:rFonts w:ascii="Arial" w:hAnsi="Arial" w:cs="Arial"/>
+          <w:sz w:val="22"/>
+          <w:szCs w:val="22"/>
+        </w:rPr>
+        <w:t xml:space="preserve"> </w:t>
+      </w:r>
+      <w:proofErr w:type="spellStart"/>
+      <w:r>
+        <w:rPr>
+          <w:rFonts w:ascii="Arial" w:hAnsi="Arial" w:cs="Arial"/>
+          <w:sz w:val="22"/>
+          <w:szCs w:val="22"/>
+        </w:rPr>
+        <w:t>velit</w:t>
+      </w:r>
+      <w:proofErr w:type="spellEnd"/>
+      <w:r>
+        <w:rPr>
+          <w:rFonts w:ascii="Arial" w:hAnsi="Arial" w:cs="Arial"/>
+          <w:sz w:val="22"/>
+          <w:szCs w:val="22"/>
+        </w:rPr>
+        <w:t xml:space="preserve"> esse </w:t>
+      </w:r>
+      <w:proofErr w:type="spellStart"/>
+      <w:r>
+        <w:rPr>
+          <w:rFonts w:ascii="Arial" w:hAnsi="Arial" w:cs="Arial"/>
+          <w:sz w:val="22"/>
+          <w:szCs w:val="22"/>
+        </w:rPr>
+        <w:t>molestie</w:t>
+      </w:r>
+      <w:proofErr w:type="spellEnd"/>
+      <w:r>
+        <w:rPr>
+          <w:rFonts w:ascii="Arial" w:hAnsi="Arial" w:cs="Arial"/>
+          <w:sz w:val="22"/>
+          <w:szCs w:val="22"/>
+        </w:rPr>
+        <w:t xml:space="preserve"> </w:t>
+      </w:r>
+      <w:proofErr w:type="spellStart"/>
+      <w:r>
+        <w:rPr>
+          <w:rFonts w:ascii="Arial" w:hAnsi="Arial" w:cs="Arial"/>
+          <w:sz w:val="22"/>
+          <w:szCs w:val="22"/>
+        </w:rPr>
+        <w:t>consequat</w:t>
+      </w:r>
+      <w:proofErr w:type="spellEnd"/>
+      <w:r>
+        <w:rPr>
+          <w:rFonts w:ascii="Arial" w:hAnsi="Arial" w:cs="Arial"/>
+          <w:sz w:val="22"/>
+          <w:szCs w:val="22"/>
+        </w:rPr>
+        <w:t xml:space="preserve">, </w:t>
+      </w:r>
+      <w:proofErr w:type="spellStart"/>
+      <w:r>
+        <w:rPr>
+          <w:rFonts w:ascii="Arial" w:hAnsi="Arial" w:cs="Arial"/>
+          <w:sz w:val="22"/>
+          <w:szCs w:val="22"/>
+        </w:rPr>
+        <w:t>vel</w:t>
+      </w:r>
+      <w:proofErr w:type="spellEnd"/>
+      <w:r>
+        <w:rPr>
+          <w:rFonts w:ascii="Arial" w:hAnsi="Arial" w:cs="Arial"/>
+          <w:sz w:val="22"/>
+          <w:szCs w:val="22"/>
+        </w:rPr>
+        <w:t xml:space="preserve"> </w:t>
+      </w:r>
+      <w:proofErr w:type="spellStart"/>
+      <w:r>
+        <w:rPr>
+          <w:rFonts w:ascii="Arial" w:hAnsi="Arial" w:cs="Arial"/>
+          <w:sz w:val="22"/>
+          <w:szCs w:val="22"/>
+        </w:rPr>
+        <w:t>illum</w:t>
+      </w:r>
+      <w:proofErr w:type="spellEnd"/>
+      <w:r>
+        <w:rPr>
+          <w:rFonts w:ascii="Arial" w:hAnsi="Arial" w:cs="Arial"/>
+          <w:sz w:val="22"/>
+          <w:szCs w:val="22"/>
+        </w:rPr>
+        <w:t xml:space="preserve"> </w:t>
+      </w:r>
+      <w:proofErr w:type="spellStart"/>
+      <w:r>
+        <w:rPr>
+          <w:rFonts w:ascii="Arial" w:hAnsi="Arial" w:cs="Arial"/>
+          <w:sz w:val="22"/>
+          <w:szCs w:val="22"/>
+        </w:rPr>
+        <w:t>dolore</w:t>
+      </w:r>
+      <w:proofErr w:type="spellEnd"/>
+      <w:r>
+        <w:rPr>
+          <w:rFonts w:ascii="Arial" w:hAnsi="Arial" w:cs="Arial"/>
+          <w:sz w:val="22"/>
+          <w:szCs w:val="22"/>
+        </w:rPr>
+        <w:t xml:space="preserve"> </w:t>
+      </w:r>
+      <w:proofErr w:type="spellStart"/>
+      <w:r>
+        <w:rPr>
+          <w:rFonts w:ascii="Arial" w:hAnsi="Arial" w:cs="Arial"/>
+          <w:sz w:val="22"/>
+          <w:szCs w:val="22"/>
+        </w:rPr>
+        <w:t>eu</w:t>
+      </w:r>
+      <w:proofErr w:type="spellEnd"/>
+      <w:r>
+        <w:rPr>
+          <w:rFonts w:ascii="Arial" w:hAnsi="Arial" w:cs="Arial"/>
+          <w:sz w:val="22"/>
+          <w:szCs w:val="22"/>
+        </w:rPr>
+        <w:t xml:space="preserve"> </w:t>
+      </w:r>
+      <w:proofErr w:type="spellStart"/>
+      <w:r>
+        <w:rPr>
+          <w:rFonts w:ascii="Arial" w:hAnsi="Arial" w:cs="Arial"/>
+          <w:sz w:val="22"/>
+          <w:szCs w:val="22"/>
+        </w:rPr>
+        <w:t>feugiat</w:t>
+      </w:r>
+      <w:proofErr w:type="spellEnd"/>
     </w:p>
     <w:p>
       <w:pPr>
@@ -627,15 +3410,1721 @@
           <w:szCs w:val="22"/>
         </w:rPr>
       </w:pPr>
-      <w:r>
-        <w:rPr>
-          <w:rFonts w:ascii="Arial" w:hAnsi="Arial" w:cs="Arial"/>
-          <w:i/>
-          <w:iCs/>
-          <w:sz w:val="22"/>
-          <w:szCs w:val="22"/>
-        </w:rPr>
-        <w:t>Lorem ipsum dolor sit amet, consetetur sadipscing elitr, sed diam nonumy eirmod tempor invidunt ut labore et dolore magna aliquyam erat, sed diam voluptua. At vero eos et accusam et justo duo dolores et ea rebum. Stet clita kasd gubergren, no sea takimata sanctus est Lorem ipsum dolor sit amet. Lorem ipsum dolor sit amet, consetetur sadipscing elitr, sed diam nonumy eirmod tempor invidunt ut labore et dolore magna aliquyam erat, sed diam voluptua. At vero eos et accusam et justo duo dolores et ea rebum. Stet clita kasd gubergren, no sea takimata sanctus est Lorem ipsum dolor sit amet.</w:t>
+      <w:proofErr w:type="spellStart"/>
+      <w:r>
+        <w:rPr>
+          <w:rFonts w:ascii="Arial" w:hAnsi="Arial" w:cs="Arial"/>
+          <w:i/>
+          <w:iCs/>
+          <w:sz w:val="22"/>
+          <w:szCs w:val="22"/>
+        </w:rPr>
+        <w:t>Lorem</w:t>
+      </w:r>
+      <w:proofErr w:type="spellEnd"/>
+      <w:r>
+        <w:rPr>
+          <w:rFonts w:ascii="Arial" w:hAnsi="Arial" w:cs="Arial"/>
+          <w:i/>
+          <w:iCs/>
+          <w:sz w:val="22"/>
+          <w:szCs w:val="22"/>
+        </w:rPr>
+        <w:t xml:space="preserve"> </w:t>
+      </w:r>
+      <w:proofErr w:type="spellStart"/>
+      <w:r>
+        <w:rPr>
+          <w:rFonts w:ascii="Arial" w:hAnsi="Arial" w:cs="Arial"/>
+          <w:i/>
+          <w:iCs/>
+          <w:sz w:val="22"/>
+          <w:szCs w:val="22"/>
+        </w:rPr>
+        <w:t>ipsum</w:t>
+      </w:r>
+      <w:proofErr w:type="spellEnd"/>
+      <w:r>
+        <w:rPr>
+          <w:rFonts w:ascii="Arial" w:hAnsi="Arial" w:cs="Arial"/>
+          <w:i/>
+          <w:iCs/>
+          <w:sz w:val="22"/>
+          <w:szCs w:val="22"/>
+        </w:rPr>
+        <w:t xml:space="preserve"> </w:t>
+      </w:r>
+      <w:proofErr w:type="spellStart"/>
+      <w:r>
+        <w:rPr>
+          <w:rFonts w:ascii="Arial" w:hAnsi="Arial" w:cs="Arial"/>
+          <w:i/>
+          <w:iCs/>
+          <w:sz w:val="22"/>
+          <w:szCs w:val="22"/>
+        </w:rPr>
+        <w:t>dolor</w:t>
+      </w:r>
+      <w:proofErr w:type="spellEnd"/>
+      <w:r>
+        <w:rPr>
+          <w:rFonts w:ascii="Arial" w:hAnsi="Arial" w:cs="Arial"/>
+          <w:i/>
+          <w:iCs/>
+          <w:sz w:val="22"/>
+          <w:szCs w:val="22"/>
+        </w:rPr>
+        <w:t xml:space="preserve"> </w:t>
+      </w:r>
+      <w:proofErr w:type="spellStart"/>
+      <w:r>
+        <w:rPr>
+          <w:rFonts w:ascii="Arial" w:hAnsi="Arial" w:cs="Arial"/>
+          <w:i/>
+          <w:iCs/>
+          <w:sz w:val="22"/>
+          <w:szCs w:val="22"/>
+        </w:rPr>
+        <w:t>sit</w:t>
+      </w:r>
+      <w:proofErr w:type="spellEnd"/>
+      <w:r>
+        <w:rPr>
+          <w:rFonts w:ascii="Arial" w:hAnsi="Arial" w:cs="Arial"/>
+          <w:i/>
+          <w:iCs/>
+          <w:sz w:val="22"/>
+          <w:szCs w:val="22"/>
+        </w:rPr>
+        <w:t xml:space="preserve"> </w:t>
+      </w:r>
+      <w:proofErr w:type="spellStart"/>
+      <w:r>
+        <w:rPr>
+          <w:rFonts w:ascii="Arial" w:hAnsi="Arial" w:cs="Arial"/>
+          <w:i/>
+          <w:iCs/>
+          <w:sz w:val="22"/>
+          <w:szCs w:val="22"/>
+        </w:rPr>
+        <w:t>amet</w:t>
+      </w:r>
+      <w:proofErr w:type="spellEnd"/>
+      <w:r>
+        <w:rPr>
+          <w:rFonts w:ascii="Arial" w:hAnsi="Arial" w:cs="Arial"/>
+          <w:i/>
+          <w:iCs/>
+          <w:sz w:val="22"/>
+          <w:szCs w:val="22"/>
+        </w:rPr>
+        <w:t xml:space="preserve">, </w:t>
+      </w:r>
+      <w:proofErr w:type="spellStart"/>
+      <w:r>
+        <w:rPr>
+          <w:rFonts w:ascii="Arial" w:hAnsi="Arial" w:cs="Arial"/>
+          <w:i/>
+          <w:iCs/>
+          <w:sz w:val="22"/>
+          <w:szCs w:val="22"/>
+        </w:rPr>
+        <w:t>consetetur</w:t>
+      </w:r>
+      <w:proofErr w:type="spellEnd"/>
+      <w:r>
+        <w:rPr>
+          <w:rFonts w:ascii="Arial" w:hAnsi="Arial" w:cs="Arial"/>
+          <w:i/>
+          <w:iCs/>
+          <w:sz w:val="22"/>
+          <w:szCs w:val="22"/>
+        </w:rPr>
+        <w:t xml:space="preserve"> </w:t>
+      </w:r>
+      <w:proofErr w:type="spellStart"/>
+      <w:r>
+        <w:rPr>
+          <w:rFonts w:ascii="Arial" w:hAnsi="Arial" w:cs="Arial"/>
+          <w:i/>
+          <w:iCs/>
+          <w:sz w:val="22"/>
+          <w:szCs w:val="22"/>
+        </w:rPr>
+        <w:t>sadipscing</w:t>
+      </w:r>
+      <w:proofErr w:type="spellEnd"/>
+      <w:r>
+        <w:rPr>
+          <w:rFonts w:ascii="Arial" w:hAnsi="Arial" w:cs="Arial"/>
+          <w:i/>
+          <w:iCs/>
+          <w:sz w:val="22"/>
+          <w:szCs w:val="22"/>
+        </w:rPr>
+        <w:t xml:space="preserve"> </w:t>
+      </w:r>
+      <w:proofErr w:type="spellStart"/>
+      <w:r>
+        <w:rPr>
+          <w:rFonts w:ascii="Arial" w:hAnsi="Arial" w:cs="Arial"/>
+          <w:i/>
+          <w:iCs/>
+          <w:sz w:val="22"/>
+          <w:szCs w:val="22"/>
+        </w:rPr>
+        <w:t>elitr</w:t>
+      </w:r>
+      <w:proofErr w:type="spellEnd"/>
+      <w:r>
+        <w:rPr>
+          <w:rFonts w:ascii="Arial" w:hAnsi="Arial" w:cs="Arial"/>
+          <w:i/>
+          <w:iCs/>
+          <w:sz w:val="22"/>
+          <w:szCs w:val="22"/>
+        </w:rPr>
+        <w:t xml:space="preserve">, sed </w:t>
+      </w:r>
+      <w:proofErr w:type="spellStart"/>
+      <w:r>
+        <w:rPr>
+          <w:rFonts w:ascii="Arial" w:hAnsi="Arial" w:cs="Arial"/>
+          <w:i/>
+          <w:iCs/>
+          <w:sz w:val="22"/>
+          <w:szCs w:val="22"/>
+        </w:rPr>
+        <w:t>diam</w:t>
+      </w:r>
+      <w:proofErr w:type="spellEnd"/>
+      <w:r>
+        <w:rPr>
+          <w:rFonts w:ascii="Arial" w:hAnsi="Arial" w:cs="Arial"/>
+          <w:i/>
+          <w:iCs/>
+          <w:sz w:val="22"/>
+          <w:szCs w:val="22"/>
+        </w:rPr>
+        <w:t xml:space="preserve"> </w:t>
+      </w:r>
+      <w:proofErr w:type="spellStart"/>
+      <w:r>
+        <w:rPr>
+          <w:rFonts w:ascii="Arial" w:hAnsi="Arial" w:cs="Arial"/>
+          <w:i/>
+          <w:iCs/>
+          <w:sz w:val="22"/>
+          <w:szCs w:val="22"/>
+        </w:rPr>
+        <w:t>nonumy</w:t>
+      </w:r>
+      <w:proofErr w:type="spellEnd"/>
+      <w:r>
+        <w:rPr>
+          <w:rFonts w:ascii="Arial" w:hAnsi="Arial" w:cs="Arial"/>
+          <w:i/>
+          <w:iCs/>
+          <w:sz w:val="22"/>
+          <w:szCs w:val="22"/>
+        </w:rPr>
+        <w:t xml:space="preserve"> </w:t>
+      </w:r>
+      <w:proofErr w:type="spellStart"/>
+      <w:r>
+        <w:rPr>
+          <w:rFonts w:ascii="Arial" w:hAnsi="Arial" w:cs="Arial"/>
+          <w:i/>
+          <w:iCs/>
+          <w:sz w:val="22"/>
+          <w:szCs w:val="22"/>
+        </w:rPr>
+        <w:t>eirmod</w:t>
+      </w:r>
+      <w:proofErr w:type="spellEnd"/>
+      <w:r>
+        <w:rPr>
+          <w:rFonts w:ascii="Arial" w:hAnsi="Arial" w:cs="Arial"/>
+          <w:i/>
+          <w:iCs/>
+          <w:sz w:val="22"/>
+          <w:szCs w:val="22"/>
+        </w:rPr>
+        <w:t xml:space="preserve"> </w:t>
+      </w:r>
+      <w:proofErr w:type="spellStart"/>
+      <w:r>
+        <w:rPr>
+          <w:rFonts w:ascii="Arial" w:hAnsi="Arial" w:cs="Arial"/>
+          <w:i/>
+          <w:iCs/>
+          <w:sz w:val="22"/>
+          <w:szCs w:val="22"/>
+        </w:rPr>
+        <w:t>tempor</w:t>
+      </w:r>
+      <w:proofErr w:type="spellEnd"/>
+      <w:r>
+        <w:rPr>
+          <w:rFonts w:ascii="Arial" w:hAnsi="Arial" w:cs="Arial"/>
+          <w:i/>
+          <w:iCs/>
+          <w:sz w:val="22"/>
+          <w:szCs w:val="22"/>
+        </w:rPr>
+        <w:t xml:space="preserve"> </w:t>
+      </w:r>
+      <w:proofErr w:type="spellStart"/>
+      <w:r>
+        <w:rPr>
+          <w:rFonts w:ascii="Arial" w:hAnsi="Arial" w:cs="Arial"/>
+          <w:i/>
+          <w:iCs/>
+          <w:sz w:val="22"/>
+          <w:szCs w:val="22"/>
+        </w:rPr>
+        <w:t>invidunt</w:t>
+      </w:r>
+      <w:proofErr w:type="spellEnd"/>
+      <w:r>
+        <w:rPr>
+          <w:rFonts w:ascii="Arial" w:hAnsi="Arial" w:cs="Arial"/>
+          <w:i/>
+          <w:iCs/>
+          <w:sz w:val="22"/>
+          <w:szCs w:val="22"/>
+        </w:rPr>
+        <w:t xml:space="preserve"> </w:t>
+      </w:r>
+      <w:proofErr w:type="spellStart"/>
+      <w:r>
+        <w:rPr>
+          <w:rFonts w:ascii="Arial" w:hAnsi="Arial" w:cs="Arial"/>
+          <w:i/>
+          <w:iCs/>
+          <w:sz w:val="22"/>
+          <w:szCs w:val="22"/>
+        </w:rPr>
+        <w:t>ut</w:t>
+      </w:r>
+      <w:proofErr w:type="spellEnd"/>
+      <w:r>
+        <w:rPr>
+          <w:rFonts w:ascii="Arial" w:hAnsi="Arial" w:cs="Arial"/>
+          <w:i/>
+          <w:iCs/>
+          <w:sz w:val="22"/>
+          <w:szCs w:val="22"/>
+        </w:rPr>
+        <w:t xml:space="preserve"> </w:t>
+      </w:r>
+      <w:proofErr w:type="spellStart"/>
+      <w:r>
+        <w:rPr>
+          <w:rFonts w:ascii="Arial" w:hAnsi="Arial" w:cs="Arial"/>
+          <w:i/>
+          <w:iCs/>
+          <w:sz w:val="22"/>
+          <w:szCs w:val="22"/>
+        </w:rPr>
+        <w:t>labore</w:t>
+      </w:r>
+      <w:proofErr w:type="spellEnd"/>
+      <w:r>
+        <w:rPr>
+          <w:rFonts w:ascii="Arial" w:hAnsi="Arial" w:cs="Arial"/>
+          <w:i/>
+          <w:iCs/>
+          <w:sz w:val="22"/>
+          <w:szCs w:val="22"/>
+        </w:rPr>
+        <w:t xml:space="preserve"> et </w:t>
+      </w:r>
+      <w:proofErr w:type="spellStart"/>
+      <w:r>
+        <w:rPr>
+          <w:rFonts w:ascii="Arial" w:hAnsi="Arial" w:cs="Arial"/>
+          <w:i/>
+          <w:iCs/>
+          <w:sz w:val="22"/>
+          <w:szCs w:val="22"/>
+        </w:rPr>
+        <w:t>dolore</w:t>
+      </w:r>
+      <w:proofErr w:type="spellEnd"/>
+      <w:r>
+        <w:rPr>
+          <w:rFonts w:ascii="Arial" w:hAnsi="Arial" w:cs="Arial"/>
+          <w:i/>
+          <w:iCs/>
+          <w:sz w:val="22"/>
+          <w:szCs w:val="22"/>
+        </w:rPr>
+        <w:t xml:space="preserve"> magna </w:t>
+      </w:r>
+      <w:proofErr w:type="spellStart"/>
+      <w:r>
+        <w:rPr>
+          <w:rFonts w:ascii="Arial" w:hAnsi="Arial" w:cs="Arial"/>
+          <w:i/>
+          <w:iCs/>
+          <w:sz w:val="22"/>
+          <w:szCs w:val="22"/>
+        </w:rPr>
+        <w:t>aliquyam</w:t>
+      </w:r>
+      <w:proofErr w:type="spellEnd"/>
+      <w:r>
+        <w:rPr>
+          <w:rFonts w:ascii="Arial" w:hAnsi="Arial" w:cs="Arial"/>
+          <w:i/>
+          <w:iCs/>
+          <w:sz w:val="22"/>
+          <w:szCs w:val="22"/>
+        </w:rPr>
+        <w:t xml:space="preserve"> erat, sed </w:t>
+      </w:r>
+      <w:proofErr w:type="spellStart"/>
+      <w:r>
+        <w:rPr>
+          <w:rFonts w:ascii="Arial" w:hAnsi="Arial" w:cs="Arial"/>
+          <w:i/>
+          <w:iCs/>
+          <w:sz w:val="22"/>
+          <w:szCs w:val="22"/>
+        </w:rPr>
+        <w:t>diam</w:t>
+      </w:r>
+      <w:proofErr w:type="spellEnd"/>
+      <w:r>
+        <w:rPr>
+          <w:rFonts w:ascii="Arial" w:hAnsi="Arial" w:cs="Arial"/>
+          <w:i/>
+          <w:iCs/>
+          <w:sz w:val="22"/>
+          <w:szCs w:val="22"/>
+        </w:rPr>
+        <w:t xml:space="preserve"> </w:t>
+      </w:r>
+      <w:proofErr w:type="spellStart"/>
+      <w:r>
+        <w:rPr>
+          <w:rFonts w:ascii="Arial" w:hAnsi="Arial" w:cs="Arial"/>
+          <w:i/>
+          <w:iCs/>
+          <w:sz w:val="22"/>
+          <w:szCs w:val="22"/>
+        </w:rPr>
+        <w:t>voluptua</w:t>
+      </w:r>
+      <w:proofErr w:type="spellEnd"/>
+      <w:r>
+        <w:rPr>
+          <w:rFonts w:ascii="Arial" w:hAnsi="Arial" w:cs="Arial"/>
+          <w:i/>
+          <w:iCs/>
+          <w:sz w:val="22"/>
+          <w:szCs w:val="22"/>
+        </w:rPr>
+        <w:t xml:space="preserve">. At </w:t>
+      </w:r>
+      <w:proofErr w:type="spellStart"/>
+      <w:r>
+        <w:rPr>
+          <w:rFonts w:ascii="Arial" w:hAnsi="Arial" w:cs="Arial"/>
+          <w:i/>
+          <w:iCs/>
+          <w:sz w:val="22"/>
+          <w:szCs w:val="22"/>
+        </w:rPr>
+        <w:t>vero</w:t>
+      </w:r>
+      <w:proofErr w:type="spellEnd"/>
+      <w:r>
+        <w:rPr>
+          <w:rFonts w:ascii="Arial" w:hAnsi="Arial" w:cs="Arial"/>
+          <w:i/>
+          <w:iCs/>
+          <w:sz w:val="22"/>
+          <w:szCs w:val="22"/>
+        </w:rPr>
+        <w:t xml:space="preserve"> </w:t>
+      </w:r>
+      <w:proofErr w:type="spellStart"/>
+      <w:r>
+        <w:rPr>
+          <w:rFonts w:ascii="Arial" w:hAnsi="Arial" w:cs="Arial"/>
+          <w:i/>
+          <w:iCs/>
+          <w:sz w:val="22"/>
+          <w:szCs w:val="22"/>
+        </w:rPr>
+        <w:t>eos</w:t>
+      </w:r>
+      <w:proofErr w:type="spellEnd"/>
+      <w:r>
+        <w:rPr>
+          <w:rFonts w:ascii="Arial" w:hAnsi="Arial" w:cs="Arial"/>
+          <w:i/>
+          <w:iCs/>
+          <w:sz w:val="22"/>
+          <w:szCs w:val="22"/>
+        </w:rPr>
+        <w:t xml:space="preserve"> et </w:t>
+      </w:r>
+      <w:proofErr w:type="spellStart"/>
+      <w:r>
+        <w:rPr>
+          <w:rFonts w:ascii="Arial" w:hAnsi="Arial" w:cs="Arial"/>
+          <w:i/>
+          <w:iCs/>
+          <w:sz w:val="22"/>
+          <w:szCs w:val="22"/>
+        </w:rPr>
+        <w:t>accusam</w:t>
+      </w:r>
+      <w:proofErr w:type="spellEnd"/>
+      <w:r>
+        <w:rPr>
+          <w:rFonts w:ascii="Arial" w:hAnsi="Arial" w:cs="Arial"/>
+          <w:i/>
+          <w:iCs/>
+          <w:sz w:val="22"/>
+          <w:szCs w:val="22"/>
+        </w:rPr>
+        <w:t xml:space="preserve"> et </w:t>
+      </w:r>
+      <w:proofErr w:type="spellStart"/>
+      <w:r>
+        <w:rPr>
+          <w:rFonts w:ascii="Arial" w:hAnsi="Arial" w:cs="Arial"/>
+          <w:i/>
+          <w:iCs/>
+          <w:sz w:val="22"/>
+          <w:szCs w:val="22"/>
+        </w:rPr>
+        <w:t>justo</w:t>
+      </w:r>
+      <w:proofErr w:type="spellEnd"/>
+      <w:r>
+        <w:rPr>
+          <w:rFonts w:ascii="Arial" w:hAnsi="Arial" w:cs="Arial"/>
+          <w:i/>
+          <w:iCs/>
+          <w:sz w:val="22"/>
+          <w:szCs w:val="22"/>
+        </w:rPr>
+        <w:t xml:space="preserve"> </w:t>
+      </w:r>
+      <w:proofErr w:type="spellStart"/>
+      <w:r>
+        <w:rPr>
+          <w:rFonts w:ascii="Arial" w:hAnsi="Arial" w:cs="Arial"/>
+          <w:i/>
+          <w:iCs/>
+          <w:sz w:val="22"/>
+          <w:szCs w:val="22"/>
+        </w:rPr>
+        <w:t>duo</w:t>
+      </w:r>
+      <w:proofErr w:type="spellEnd"/>
+      <w:r>
+        <w:rPr>
+          <w:rFonts w:ascii="Arial" w:hAnsi="Arial" w:cs="Arial"/>
+          <w:i/>
+          <w:iCs/>
+          <w:sz w:val="22"/>
+          <w:szCs w:val="22"/>
+        </w:rPr>
+        <w:t xml:space="preserve"> </w:t>
+      </w:r>
+      <w:proofErr w:type="spellStart"/>
+      <w:r>
+        <w:rPr>
+          <w:rFonts w:ascii="Arial" w:hAnsi="Arial" w:cs="Arial"/>
+          <w:i/>
+          <w:iCs/>
+          <w:sz w:val="22"/>
+          <w:szCs w:val="22"/>
+        </w:rPr>
+        <w:t>dolores</w:t>
+      </w:r>
+      <w:proofErr w:type="spellEnd"/>
+      <w:r>
+        <w:rPr>
+          <w:rFonts w:ascii="Arial" w:hAnsi="Arial" w:cs="Arial"/>
+          <w:i/>
+          <w:iCs/>
+          <w:sz w:val="22"/>
+          <w:szCs w:val="22"/>
+        </w:rPr>
+        <w:t xml:space="preserve"> et </w:t>
+      </w:r>
+      <w:proofErr w:type="spellStart"/>
+      <w:r>
+        <w:rPr>
+          <w:rFonts w:ascii="Arial" w:hAnsi="Arial" w:cs="Arial"/>
+          <w:i/>
+          <w:iCs/>
+          <w:sz w:val="22"/>
+          <w:szCs w:val="22"/>
+        </w:rPr>
+        <w:t>ea</w:t>
+      </w:r>
+      <w:proofErr w:type="spellEnd"/>
+      <w:r>
+        <w:rPr>
+          <w:rFonts w:ascii="Arial" w:hAnsi="Arial" w:cs="Arial"/>
+          <w:i/>
+          <w:iCs/>
+          <w:sz w:val="22"/>
+          <w:szCs w:val="22"/>
+        </w:rPr>
+        <w:t xml:space="preserve"> </w:t>
+      </w:r>
+      <w:proofErr w:type="spellStart"/>
+      <w:r>
+        <w:rPr>
+          <w:rFonts w:ascii="Arial" w:hAnsi="Arial" w:cs="Arial"/>
+          <w:i/>
+          <w:iCs/>
+          <w:sz w:val="22"/>
+          <w:szCs w:val="22"/>
+        </w:rPr>
+        <w:t>rebum</w:t>
+      </w:r>
+      <w:proofErr w:type="spellEnd"/>
+      <w:r>
+        <w:rPr>
+          <w:rFonts w:ascii="Arial" w:hAnsi="Arial" w:cs="Arial"/>
+          <w:i/>
+          <w:iCs/>
+          <w:sz w:val="22"/>
+          <w:szCs w:val="22"/>
+        </w:rPr>
+        <w:t xml:space="preserve">. Stet </w:t>
+      </w:r>
+      <w:proofErr w:type="spellStart"/>
+      <w:r>
+        <w:rPr>
+          <w:rFonts w:ascii="Arial" w:hAnsi="Arial" w:cs="Arial"/>
+          <w:i/>
+          <w:iCs/>
+          <w:sz w:val="22"/>
+          <w:szCs w:val="22"/>
+        </w:rPr>
+        <w:t>clita</w:t>
+      </w:r>
+      <w:proofErr w:type="spellEnd"/>
+      <w:r>
+        <w:rPr>
+          <w:rFonts w:ascii="Arial" w:hAnsi="Arial" w:cs="Arial"/>
+          <w:i/>
+          <w:iCs/>
+          <w:sz w:val="22"/>
+          <w:szCs w:val="22"/>
+        </w:rPr>
+        <w:t xml:space="preserve"> </w:t>
+      </w:r>
+      <w:proofErr w:type="spellStart"/>
+      <w:r>
+        <w:rPr>
+          <w:rFonts w:ascii="Arial" w:hAnsi="Arial" w:cs="Arial"/>
+          <w:i/>
+          <w:iCs/>
+          <w:sz w:val="22"/>
+          <w:szCs w:val="22"/>
+        </w:rPr>
+        <w:t>kasd</w:t>
+      </w:r>
+      <w:proofErr w:type="spellEnd"/>
+      <w:r>
+        <w:rPr>
+          <w:rFonts w:ascii="Arial" w:hAnsi="Arial" w:cs="Arial"/>
+          <w:i/>
+          <w:iCs/>
+          <w:sz w:val="22"/>
+          <w:szCs w:val="22"/>
+        </w:rPr>
+        <w:t xml:space="preserve"> </w:t>
+      </w:r>
+      <w:proofErr w:type="spellStart"/>
+      <w:r>
+        <w:rPr>
+          <w:rFonts w:ascii="Arial" w:hAnsi="Arial" w:cs="Arial"/>
+          <w:i/>
+          <w:iCs/>
+          <w:sz w:val="22"/>
+          <w:szCs w:val="22"/>
+        </w:rPr>
+        <w:t>gubergren</w:t>
+      </w:r>
+      <w:proofErr w:type="spellEnd"/>
+      <w:r>
+        <w:rPr>
+          <w:rFonts w:ascii="Arial" w:hAnsi="Arial" w:cs="Arial"/>
+          <w:i/>
+          <w:iCs/>
+          <w:sz w:val="22"/>
+          <w:szCs w:val="22"/>
+        </w:rPr>
+        <w:t xml:space="preserve">, </w:t>
+      </w:r>
+      <w:proofErr w:type="spellStart"/>
+      <w:r>
+        <w:rPr>
+          <w:rFonts w:ascii="Arial" w:hAnsi="Arial" w:cs="Arial"/>
+          <w:i/>
+          <w:iCs/>
+          <w:sz w:val="22"/>
+          <w:szCs w:val="22"/>
+        </w:rPr>
+        <w:t>no</w:t>
+      </w:r>
+      <w:proofErr w:type="spellEnd"/>
+      <w:r>
+        <w:rPr>
+          <w:rFonts w:ascii="Arial" w:hAnsi="Arial" w:cs="Arial"/>
+          <w:i/>
+          <w:iCs/>
+          <w:sz w:val="22"/>
+          <w:szCs w:val="22"/>
+        </w:rPr>
+        <w:t xml:space="preserve"> </w:t>
+      </w:r>
+      <w:proofErr w:type="spellStart"/>
+      <w:r>
+        <w:rPr>
+          <w:rFonts w:ascii="Arial" w:hAnsi="Arial" w:cs="Arial"/>
+          <w:i/>
+          <w:iCs/>
+          <w:sz w:val="22"/>
+          <w:szCs w:val="22"/>
+        </w:rPr>
+        <w:t>sea</w:t>
+      </w:r>
+      <w:proofErr w:type="spellEnd"/>
+      <w:r>
+        <w:rPr>
+          <w:rFonts w:ascii="Arial" w:hAnsi="Arial" w:cs="Arial"/>
+          <w:i/>
+          <w:iCs/>
+          <w:sz w:val="22"/>
+          <w:szCs w:val="22"/>
+        </w:rPr>
+        <w:t xml:space="preserve"> </w:t>
+      </w:r>
+      <w:proofErr w:type="spellStart"/>
+      <w:r>
+        <w:rPr>
+          <w:rFonts w:ascii="Arial" w:hAnsi="Arial" w:cs="Arial"/>
+          <w:i/>
+          <w:iCs/>
+          <w:sz w:val="22"/>
+          <w:szCs w:val="22"/>
+        </w:rPr>
+        <w:t>takimata</w:t>
+      </w:r>
+      <w:proofErr w:type="spellEnd"/>
+      <w:r>
+        <w:rPr>
+          <w:rFonts w:ascii="Arial" w:hAnsi="Arial" w:cs="Arial"/>
+          <w:i/>
+          <w:iCs/>
+          <w:sz w:val="22"/>
+          <w:szCs w:val="22"/>
+        </w:rPr>
+        <w:t xml:space="preserve"> sanctus </w:t>
+      </w:r>
+      <w:proofErr w:type="spellStart"/>
+      <w:r>
+        <w:rPr>
+          <w:rFonts w:ascii="Arial" w:hAnsi="Arial" w:cs="Arial"/>
+          <w:i/>
+          <w:iCs/>
+          <w:sz w:val="22"/>
+          <w:szCs w:val="22"/>
+        </w:rPr>
+        <w:t>est</w:t>
+      </w:r>
+      <w:proofErr w:type="spellEnd"/>
+      <w:r>
+        <w:rPr>
+          <w:rFonts w:ascii="Arial" w:hAnsi="Arial" w:cs="Arial"/>
+          <w:i/>
+          <w:iCs/>
+          <w:sz w:val="22"/>
+          <w:szCs w:val="22"/>
+        </w:rPr>
+        <w:t xml:space="preserve"> </w:t>
+      </w:r>
+      <w:proofErr w:type="spellStart"/>
+      <w:r>
+        <w:rPr>
+          <w:rFonts w:ascii="Arial" w:hAnsi="Arial" w:cs="Arial"/>
+          <w:i/>
+          <w:iCs/>
+          <w:sz w:val="22"/>
+          <w:szCs w:val="22"/>
+        </w:rPr>
+        <w:t>Lorem</w:t>
+      </w:r>
+      <w:proofErr w:type="spellEnd"/>
+      <w:r>
+        <w:rPr>
+          <w:rFonts w:ascii="Arial" w:hAnsi="Arial" w:cs="Arial"/>
+          <w:i/>
+          <w:iCs/>
+          <w:sz w:val="22"/>
+          <w:szCs w:val="22"/>
+        </w:rPr>
+        <w:t xml:space="preserve"> </w:t>
+      </w:r>
+      <w:proofErr w:type="spellStart"/>
+      <w:r>
+        <w:rPr>
+          <w:rFonts w:ascii="Arial" w:hAnsi="Arial" w:cs="Arial"/>
+          <w:i/>
+          <w:iCs/>
+          <w:sz w:val="22"/>
+          <w:szCs w:val="22"/>
+        </w:rPr>
+        <w:t>ipsum</w:t>
+      </w:r>
+      <w:proofErr w:type="spellEnd"/>
+      <w:r>
+        <w:rPr>
+          <w:rFonts w:ascii="Arial" w:hAnsi="Arial" w:cs="Arial"/>
+          <w:i/>
+          <w:iCs/>
+          <w:sz w:val="22"/>
+          <w:szCs w:val="22"/>
+        </w:rPr>
+        <w:t xml:space="preserve"> </w:t>
+      </w:r>
+      <w:proofErr w:type="spellStart"/>
+      <w:r>
+        <w:rPr>
+          <w:rFonts w:ascii="Arial" w:hAnsi="Arial" w:cs="Arial"/>
+          <w:i/>
+          <w:iCs/>
+          <w:sz w:val="22"/>
+          <w:szCs w:val="22"/>
+        </w:rPr>
+        <w:t>dolor</w:t>
+      </w:r>
+      <w:proofErr w:type="spellEnd"/>
+      <w:r>
+        <w:rPr>
+          <w:rFonts w:ascii="Arial" w:hAnsi="Arial" w:cs="Arial"/>
+          <w:i/>
+          <w:iCs/>
+          <w:sz w:val="22"/>
+          <w:szCs w:val="22"/>
+        </w:rPr>
+        <w:t xml:space="preserve"> </w:t>
+      </w:r>
+      <w:proofErr w:type="spellStart"/>
+      <w:r>
+        <w:rPr>
+          <w:rFonts w:ascii="Arial" w:hAnsi="Arial" w:cs="Arial"/>
+          <w:i/>
+          <w:iCs/>
+          <w:sz w:val="22"/>
+          <w:szCs w:val="22"/>
+        </w:rPr>
+        <w:t>sit</w:t>
+      </w:r>
+      <w:proofErr w:type="spellEnd"/>
+      <w:r>
+        <w:rPr>
+          <w:rFonts w:ascii="Arial" w:hAnsi="Arial" w:cs="Arial"/>
+          <w:i/>
+          <w:iCs/>
+          <w:sz w:val="22"/>
+          <w:szCs w:val="22"/>
+        </w:rPr>
+        <w:t xml:space="preserve"> </w:t>
+      </w:r>
+      <w:proofErr w:type="spellStart"/>
+      <w:r>
+        <w:rPr>
+          <w:rFonts w:ascii="Arial" w:hAnsi="Arial" w:cs="Arial"/>
+          <w:i/>
+          <w:iCs/>
+          <w:sz w:val="22"/>
+          <w:szCs w:val="22"/>
+        </w:rPr>
+        <w:t>amet</w:t>
+      </w:r>
+      <w:proofErr w:type="spellEnd"/>
+      <w:r>
+        <w:rPr>
+          <w:rFonts w:ascii="Arial" w:hAnsi="Arial" w:cs="Arial"/>
+          <w:i/>
+          <w:iCs/>
+          <w:sz w:val="22"/>
+          <w:szCs w:val="22"/>
+        </w:rPr>
+        <w:t xml:space="preserve">. </w:t>
+      </w:r>
+      <w:proofErr w:type="spellStart"/>
+      <w:r>
+        <w:rPr>
+          <w:rFonts w:ascii="Arial" w:hAnsi="Arial" w:cs="Arial"/>
+          <w:i/>
+          <w:iCs/>
+          <w:sz w:val="22"/>
+          <w:szCs w:val="22"/>
+        </w:rPr>
+        <w:t>Lorem</w:t>
+      </w:r>
+      <w:proofErr w:type="spellEnd"/>
+      <w:r>
+        <w:rPr>
+          <w:rFonts w:ascii="Arial" w:hAnsi="Arial" w:cs="Arial"/>
+          <w:i/>
+          <w:iCs/>
+          <w:sz w:val="22"/>
+          <w:szCs w:val="22"/>
+        </w:rPr>
+        <w:t xml:space="preserve"> </w:t>
+      </w:r>
+      <w:proofErr w:type="spellStart"/>
+      <w:r>
+        <w:rPr>
+          <w:rFonts w:ascii="Arial" w:hAnsi="Arial" w:cs="Arial"/>
+          <w:i/>
+          <w:iCs/>
+          <w:sz w:val="22"/>
+          <w:szCs w:val="22"/>
+        </w:rPr>
+        <w:t>ipsum</w:t>
+      </w:r>
+      <w:proofErr w:type="spellEnd"/>
+      <w:r>
+        <w:rPr>
+          <w:rFonts w:ascii="Arial" w:hAnsi="Arial" w:cs="Arial"/>
+          <w:i/>
+          <w:iCs/>
+          <w:sz w:val="22"/>
+          <w:szCs w:val="22"/>
+        </w:rPr>
+        <w:t xml:space="preserve"> </w:t>
+      </w:r>
+      <w:proofErr w:type="spellStart"/>
+      <w:r>
+        <w:rPr>
+          <w:rFonts w:ascii="Arial" w:hAnsi="Arial" w:cs="Arial"/>
+          <w:i/>
+          <w:iCs/>
+          <w:sz w:val="22"/>
+          <w:szCs w:val="22"/>
+        </w:rPr>
+        <w:t>dolor</w:t>
+      </w:r>
+      <w:proofErr w:type="spellEnd"/>
+      <w:r>
+        <w:rPr>
+          <w:rFonts w:ascii="Arial" w:hAnsi="Arial" w:cs="Arial"/>
+          <w:i/>
+          <w:iCs/>
+          <w:sz w:val="22"/>
+          <w:szCs w:val="22"/>
+        </w:rPr>
+        <w:t xml:space="preserve"> </w:t>
+      </w:r>
+      <w:proofErr w:type="spellStart"/>
+      <w:r>
+        <w:rPr>
+          <w:rFonts w:ascii="Arial" w:hAnsi="Arial" w:cs="Arial"/>
+          <w:i/>
+          <w:iCs/>
+          <w:sz w:val="22"/>
+          <w:szCs w:val="22"/>
+        </w:rPr>
+        <w:t>sit</w:t>
+      </w:r>
+      <w:proofErr w:type="spellEnd"/>
+      <w:r>
+        <w:rPr>
+          <w:rFonts w:ascii="Arial" w:hAnsi="Arial" w:cs="Arial"/>
+          <w:i/>
+          <w:iCs/>
+          <w:sz w:val="22"/>
+          <w:szCs w:val="22"/>
+        </w:rPr>
+        <w:t xml:space="preserve"> </w:t>
+      </w:r>
+      <w:proofErr w:type="spellStart"/>
+      <w:r>
+        <w:rPr>
+          <w:rFonts w:ascii="Arial" w:hAnsi="Arial" w:cs="Arial"/>
+          <w:i/>
+          <w:iCs/>
+          <w:sz w:val="22"/>
+          <w:szCs w:val="22"/>
+        </w:rPr>
+        <w:t>amet</w:t>
+      </w:r>
+      <w:proofErr w:type="spellEnd"/>
+      <w:r>
+        <w:rPr>
+          <w:rFonts w:ascii="Arial" w:hAnsi="Arial" w:cs="Arial"/>
+          <w:i/>
+          <w:iCs/>
+          <w:sz w:val="22"/>
+          <w:szCs w:val="22"/>
+        </w:rPr>
+        <w:t xml:space="preserve">, </w:t>
+      </w:r>
+      <w:proofErr w:type="spellStart"/>
+      <w:r>
+        <w:rPr>
+          <w:rFonts w:ascii="Arial" w:hAnsi="Arial" w:cs="Arial"/>
+          <w:i/>
+          <w:iCs/>
+          <w:sz w:val="22"/>
+          <w:szCs w:val="22"/>
+        </w:rPr>
+        <w:t>consetetur</w:t>
+      </w:r>
+      <w:proofErr w:type="spellEnd"/>
+      <w:r>
+        <w:rPr>
+          <w:rFonts w:ascii="Arial" w:hAnsi="Arial" w:cs="Arial"/>
+          <w:i/>
+          <w:iCs/>
+          <w:sz w:val="22"/>
+          <w:szCs w:val="22"/>
+        </w:rPr>
+        <w:t xml:space="preserve"> </w:t>
+      </w:r>
+      <w:proofErr w:type="spellStart"/>
+      <w:r>
+        <w:rPr>
+          <w:rFonts w:ascii="Arial" w:hAnsi="Arial" w:cs="Arial"/>
+          <w:i/>
+          <w:iCs/>
+          <w:sz w:val="22"/>
+          <w:szCs w:val="22"/>
+        </w:rPr>
+        <w:t>sadipscing</w:t>
+      </w:r>
+      <w:proofErr w:type="spellEnd"/>
+      <w:r>
+        <w:rPr>
+          <w:rFonts w:ascii="Arial" w:hAnsi="Arial" w:cs="Arial"/>
+          <w:i/>
+          <w:iCs/>
+          <w:sz w:val="22"/>
+          <w:szCs w:val="22"/>
+        </w:rPr>
+        <w:t xml:space="preserve"> </w:t>
+      </w:r>
+      <w:proofErr w:type="spellStart"/>
+      <w:r>
+        <w:rPr>
+          <w:rFonts w:ascii="Arial" w:hAnsi="Arial" w:cs="Arial"/>
+          <w:i/>
+          <w:iCs/>
+          <w:sz w:val="22"/>
+          <w:szCs w:val="22"/>
+        </w:rPr>
+        <w:t>elitr</w:t>
+      </w:r>
+      <w:proofErr w:type="spellEnd"/>
+      <w:r>
+        <w:rPr>
+          <w:rFonts w:ascii="Arial" w:hAnsi="Arial" w:cs="Arial"/>
+          <w:i/>
+          <w:iCs/>
+          <w:sz w:val="22"/>
+          <w:szCs w:val="22"/>
+        </w:rPr>
+        <w:t xml:space="preserve">, sed </w:t>
+      </w:r>
+      <w:proofErr w:type="spellStart"/>
+      <w:r>
+        <w:rPr>
+          <w:rFonts w:ascii="Arial" w:hAnsi="Arial" w:cs="Arial"/>
+          <w:i/>
+          <w:iCs/>
+          <w:sz w:val="22"/>
+          <w:szCs w:val="22"/>
+        </w:rPr>
+        <w:t>diam</w:t>
+      </w:r>
+      <w:proofErr w:type="spellEnd"/>
+      <w:r>
+        <w:rPr>
+          <w:rFonts w:ascii="Arial" w:hAnsi="Arial" w:cs="Arial"/>
+          <w:i/>
+          <w:iCs/>
+          <w:sz w:val="22"/>
+          <w:szCs w:val="22"/>
+        </w:rPr>
+        <w:t xml:space="preserve"> </w:t>
+      </w:r>
+      <w:proofErr w:type="spellStart"/>
+      <w:r>
+        <w:rPr>
+          <w:rFonts w:ascii="Arial" w:hAnsi="Arial" w:cs="Arial"/>
+          <w:i/>
+          <w:iCs/>
+          <w:sz w:val="22"/>
+          <w:szCs w:val="22"/>
+        </w:rPr>
+        <w:t>nonumy</w:t>
+      </w:r>
+      <w:proofErr w:type="spellEnd"/>
+      <w:r>
+        <w:rPr>
+          <w:rFonts w:ascii="Arial" w:hAnsi="Arial" w:cs="Arial"/>
+          <w:i/>
+          <w:iCs/>
+          <w:sz w:val="22"/>
+          <w:szCs w:val="22"/>
+        </w:rPr>
+        <w:t xml:space="preserve"> </w:t>
+      </w:r>
+      <w:proofErr w:type="spellStart"/>
+      <w:r>
+        <w:rPr>
+          <w:rFonts w:ascii="Arial" w:hAnsi="Arial" w:cs="Arial"/>
+          <w:i/>
+          <w:iCs/>
+          <w:sz w:val="22"/>
+          <w:szCs w:val="22"/>
+        </w:rPr>
+        <w:t>eirmod</w:t>
+      </w:r>
+      <w:proofErr w:type="spellEnd"/>
+      <w:r>
+        <w:rPr>
+          <w:rFonts w:ascii="Arial" w:hAnsi="Arial" w:cs="Arial"/>
+          <w:i/>
+          <w:iCs/>
+          <w:sz w:val="22"/>
+          <w:szCs w:val="22"/>
+        </w:rPr>
+        <w:t xml:space="preserve"> </w:t>
+      </w:r>
+      <w:proofErr w:type="spellStart"/>
+      <w:r>
+        <w:rPr>
+          <w:rFonts w:ascii="Arial" w:hAnsi="Arial" w:cs="Arial"/>
+          <w:i/>
+          <w:iCs/>
+          <w:sz w:val="22"/>
+          <w:szCs w:val="22"/>
+        </w:rPr>
+        <w:t>tempor</w:t>
+      </w:r>
+      <w:proofErr w:type="spellEnd"/>
+      <w:r>
+        <w:rPr>
+          <w:rFonts w:ascii="Arial" w:hAnsi="Arial" w:cs="Arial"/>
+          <w:i/>
+          <w:iCs/>
+          <w:sz w:val="22"/>
+          <w:szCs w:val="22"/>
+        </w:rPr>
+        <w:t xml:space="preserve"> </w:t>
+      </w:r>
+      <w:proofErr w:type="spellStart"/>
+      <w:r>
+        <w:rPr>
+          <w:rFonts w:ascii="Arial" w:hAnsi="Arial" w:cs="Arial"/>
+          <w:i/>
+          <w:iCs/>
+          <w:sz w:val="22"/>
+          <w:szCs w:val="22"/>
+        </w:rPr>
+        <w:t>invidunt</w:t>
+      </w:r>
+      <w:proofErr w:type="spellEnd"/>
+      <w:r>
+        <w:rPr>
+          <w:rFonts w:ascii="Arial" w:hAnsi="Arial" w:cs="Arial"/>
+          <w:i/>
+          <w:iCs/>
+          <w:sz w:val="22"/>
+          <w:szCs w:val="22"/>
+        </w:rPr>
+        <w:t xml:space="preserve"> </w:t>
+      </w:r>
+      <w:proofErr w:type="spellStart"/>
+      <w:r>
+        <w:rPr>
+          <w:rFonts w:ascii="Arial" w:hAnsi="Arial" w:cs="Arial"/>
+          <w:i/>
+          <w:iCs/>
+          <w:sz w:val="22"/>
+          <w:szCs w:val="22"/>
+        </w:rPr>
+        <w:t>ut</w:t>
+      </w:r>
+      <w:proofErr w:type="spellEnd"/>
+      <w:r>
+        <w:rPr>
+          <w:rFonts w:ascii="Arial" w:hAnsi="Arial" w:cs="Arial"/>
+          <w:i/>
+          <w:iCs/>
+          <w:sz w:val="22"/>
+          <w:szCs w:val="22"/>
+        </w:rPr>
+        <w:t xml:space="preserve"> </w:t>
+      </w:r>
+      <w:proofErr w:type="spellStart"/>
+      <w:r>
+        <w:rPr>
+          <w:rFonts w:ascii="Arial" w:hAnsi="Arial" w:cs="Arial"/>
+          <w:i/>
+          <w:iCs/>
+          <w:sz w:val="22"/>
+          <w:szCs w:val="22"/>
+        </w:rPr>
+        <w:t>labore</w:t>
+      </w:r>
+      <w:proofErr w:type="spellEnd"/>
+      <w:r>
+        <w:rPr>
+          <w:rFonts w:ascii="Arial" w:hAnsi="Arial" w:cs="Arial"/>
+          <w:i/>
+          <w:iCs/>
+          <w:sz w:val="22"/>
+          <w:szCs w:val="22"/>
+        </w:rPr>
+        <w:t xml:space="preserve"> et </w:t>
+      </w:r>
+      <w:proofErr w:type="spellStart"/>
+      <w:r>
+        <w:rPr>
+          <w:rFonts w:ascii="Arial" w:hAnsi="Arial" w:cs="Arial"/>
+          <w:i/>
+          <w:iCs/>
+          <w:sz w:val="22"/>
+          <w:szCs w:val="22"/>
+        </w:rPr>
+        <w:t>dolore</w:t>
+      </w:r>
+      <w:proofErr w:type="spellEnd"/>
+      <w:r>
+        <w:rPr>
+          <w:rFonts w:ascii="Arial" w:hAnsi="Arial" w:cs="Arial"/>
+          <w:i/>
+          <w:iCs/>
+          <w:sz w:val="22"/>
+          <w:szCs w:val="22"/>
+        </w:rPr>
+        <w:t xml:space="preserve"> magna </w:t>
+      </w:r>
+      <w:proofErr w:type="spellStart"/>
+      <w:r>
+        <w:rPr>
+          <w:rFonts w:ascii="Arial" w:hAnsi="Arial" w:cs="Arial"/>
+          <w:i/>
+          <w:iCs/>
+          <w:sz w:val="22"/>
+          <w:szCs w:val="22"/>
+        </w:rPr>
+        <w:t>aliquyam</w:t>
+      </w:r>
+      <w:proofErr w:type="spellEnd"/>
+      <w:r>
+        <w:rPr>
+          <w:rFonts w:ascii="Arial" w:hAnsi="Arial" w:cs="Arial"/>
+          <w:i/>
+          <w:iCs/>
+          <w:sz w:val="22"/>
+          <w:szCs w:val="22"/>
+        </w:rPr>
+        <w:t xml:space="preserve"> erat, sed </w:t>
+      </w:r>
+      <w:proofErr w:type="spellStart"/>
+      <w:r>
+        <w:rPr>
+          <w:rFonts w:ascii="Arial" w:hAnsi="Arial" w:cs="Arial"/>
+          <w:i/>
+          <w:iCs/>
+          <w:sz w:val="22"/>
+          <w:szCs w:val="22"/>
+        </w:rPr>
+        <w:t>diam</w:t>
+      </w:r>
+      <w:proofErr w:type="spellEnd"/>
+      <w:r>
+        <w:rPr>
+          <w:rFonts w:ascii="Arial" w:hAnsi="Arial" w:cs="Arial"/>
+          <w:i/>
+          <w:iCs/>
+          <w:sz w:val="22"/>
+          <w:szCs w:val="22"/>
+        </w:rPr>
+        <w:t xml:space="preserve"> </w:t>
+      </w:r>
+      <w:proofErr w:type="spellStart"/>
+      <w:r>
+        <w:rPr>
+          <w:rFonts w:ascii="Arial" w:hAnsi="Arial" w:cs="Arial"/>
+          <w:i/>
+          <w:iCs/>
+          <w:sz w:val="22"/>
+          <w:szCs w:val="22"/>
+        </w:rPr>
+        <w:t>voluptua</w:t>
+      </w:r>
+      <w:proofErr w:type="spellEnd"/>
+      <w:r>
+        <w:rPr>
+          <w:rFonts w:ascii="Arial" w:hAnsi="Arial" w:cs="Arial"/>
+          <w:i/>
+          <w:iCs/>
+          <w:sz w:val="22"/>
+          <w:szCs w:val="22"/>
+        </w:rPr>
+        <w:t xml:space="preserve">. At </w:t>
+      </w:r>
+      <w:proofErr w:type="spellStart"/>
+      <w:r>
+        <w:rPr>
+          <w:rFonts w:ascii="Arial" w:hAnsi="Arial" w:cs="Arial"/>
+          <w:i/>
+          <w:iCs/>
+          <w:sz w:val="22"/>
+          <w:szCs w:val="22"/>
+        </w:rPr>
+        <w:t>vero</w:t>
+      </w:r>
+      <w:proofErr w:type="spellEnd"/>
+      <w:r>
+        <w:rPr>
+          <w:rFonts w:ascii="Arial" w:hAnsi="Arial" w:cs="Arial"/>
+          <w:i/>
+          <w:iCs/>
+          <w:sz w:val="22"/>
+          <w:szCs w:val="22"/>
+        </w:rPr>
+        <w:t xml:space="preserve"> </w:t>
+      </w:r>
+      <w:proofErr w:type="spellStart"/>
+      <w:r>
+        <w:rPr>
+          <w:rFonts w:ascii="Arial" w:hAnsi="Arial" w:cs="Arial"/>
+          <w:i/>
+          <w:iCs/>
+          <w:sz w:val="22"/>
+          <w:szCs w:val="22"/>
+        </w:rPr>
+        <w:t>eos</w:t>
+      </w:r>
+      <w:proofErr w:type="spellEnd"/>
+      <w:r>
+        <w:rPr>
+          <w:rFonts w:ascii="Arial" w:hAnsi="Arial" w:cs="Arial"/>
+          <w:i/>
+          <w:iCs/>
+          <w:sz w:val="22"/>
+          <w:szCs w:val="22"/>
+        </w:rPr>
+        <w:t xml:space="preserve"> et </w:t>
+      </w:r>
+      <w:proofErr w:type="spellStart"/>
+      <w:r>
+        <w:rPr>
+          <w:rFonts w:ascii="Arial" w:hAnsi="Arial" w:cs="Arial"/>
+          <w:i/>
+          <w:iCs/>
+          <w:sz w:val="22"/>
+          <w:szCs w:val="22"/>
+        </w:rPr>
+        <w:t>accusam</w:t>
+      </w:r>
+      <w:proofErr w:type="spellEnd"/>
+      <w:r>
+        <w:rPr>
+          <w:rFonts w:ascii="Arial" w:hAnsi="Arial" w:cs="Arial"/>
+          <w:i/>
+          <w:iCs/>
+          <w:sz w:val="22"/>
+          <w:szCs w:val="22"/>
+        </w:rPr>
+        <w:t xml:space="preserve"> et </w:t>
+      </w:r>
+      <w:proofErr w:type="spellStart"/>
+      <w:r>
+        <w:rPr>
+          <w:rFonts w:ascii="Arial" w:hAnsi="Arial" w:cs="Arial"/>
+          <w:i/>
+          <w:iCs/>
+          <w:sz w:val="22"/>
+          <w:szCs w:val="22"/>
+        </w:rPr>
+        <w:t>justo</w:t>
+      </w:r>
+      <w:proofErr w:type="spellEnd"/>
+      <w:r>
+        <w:rPr>
+          <w:rFonts w:ascii="Arial" w:hAnsi="Arial" w:cs="Arial"/>
+          <w:i/>
+          <w:iCs/>
+          <w:sz w:val="22"/>
+          <w:szCs w:val="22"/>
+        </w:rPr>
+        <w:t xml:space="preserve"> </w:t>
+      </w:r>
+      <w:proofErr w:type="spellStart"/>
+      <w:r>
+        <w:rPr>
+          <w:rFonts w:ascii="Arial" w:hAnsi="Arial" w:cs="Arial"/>
+          <w:i/>
+          <w:iCs/>
+          <w:sz w:val="22"/>
+          <w:szCs w:val="22"/>
+        </w:rPr>
+        <w:t>duo</w:t>
+      </w:r>
+      <w:proofErr w:type="spellEnd"/>
+      <w:r>
+        <w:rPr>
+          <w:rFonts w:ascii="Arial" w:hAnsi="Arial" w:cs="Arial"/>
+          <w:i/>
+          <w:iCs/>
+          <w:sz w:val="22"/>
+          <w:szCs w:val="22"/>
+        </w:rPr>
+        <w:t xml:space="preserve"> </w:t>
+      </w:r>
+      <w:proofErr w:type="spellStart"/>
+      <w:r>
+        <w:rPr>
+          <w:rFonts w:ascii="Arial" w:hAnsi="Arial" w:cs="Arial"/>
+          <w:i/>
+          <w:iCs/>
+          <w:sz w:val="22"/>
+          <w:szCs w:val="22"/>
+        </w:rPr>
+        <w:t>dolores</w:t>
+      </w:r>
+      <w:proofErr w:type="spellEnd"/>
+      <w:r>
+        <w:rPr>
+          <w:rFonts w:ascii="Arial" w:hAnsi="Arial" w:cs="Arial"/>
+          <w:i/>
+          <w:iCs/>
+          <w:sz w:val="22"/>
+          <w:szCs w:val="22"/>
+        </w:rPr>
+        <w:t xml:space="preserve"> et </w:t>
+      </w:r>
+      <w:proofErr w:type="spellStart"/>
+      <w:r>
+        <w:rPr>
+          <w:rFonts w:ascii="Arial" w:hAnsi="Arial" w:cs="Arial"/>
+          <w:i/>
+          <w:iCs/>
+          <w:sz w:val="22"/>
+          <w:szCs w:val="22"/>
+        </w:rPr>
+        <w:t>ea</w:t>
+      </w:r>
+      <w:proofErr w:type="spellEnd"/>
+      <w:r>
+        <w:rPr>
+          <w:rFonts w:ascii="Arial" w:hAnsi="Arial" w:cs="Arial"/>
+          <w:i/>
+          <w:iCs/>
+          <w:sz w:val="22"/>
+          <w:szCs w:val="22"/>
+        </w:rPr>
+        <w:t xml:space="preserve"> </w:t>
+      </w:r>
+      <w:proofErr w:type="spellStart"/>
+      <w:r>
+        <w:rPr>
+          <w:rFonts w:ascii="Arial" w:hAnsi="Arial" w:cs="Arial"/>
+          <w:i/>
+          <w:iCs/>
+          <w:sz w:val="22"/>
+          <w:szCs w:val="22"/>
+        </w:rPr>
+        <w:t>rebum</w:t>
+      </w:r>
+      <w:proofErr w:type="spellEnd"/>
+      <w:r>
+        <w:rPr>
+          <w:rFonts w:ascii="Arial" w:hAnsi="Arial" w:cs="Arial"/>
+          <w:i/>
+          <w:iCs/>
+          <w:sz w:val="22"/>
+          <w:szCs w:val="22"/>
+        </w:rPr>
+        <w:t xml:space="preserve">. Stet </w:t>
+      </w:r>
+      <w:proofErr w:type="spellStart"/>
+      <w:r>
+        <w:rPr>
+          <w:rFonts w:ascii="Arial" w:hAnsi="Arial" w:cs="Arial"/>
+          <w:i/>
+          <w:iCs/>
+          <w:sz w:val="22"/>
+          <w:szCs w:val="22"/>
+        </w:rPr>
+        <w:t>clita</w:t>
+      </w:r>
+      <w:proofErr w:type="spellEnd"/>
+      <w:r>
+        <w:rPr>
+          <w:rFonts w:ascii="Arial" w:hAnsi="Arial" w:cs="Arial"/>
+          <w:i/>
+          <w:iCs/>
+          <w:sz w:val="22"/>
+          <w:szCs w:val="22"/>
+        </w:rPr>
+        <w:t xml:space="preserve"> </w:t>
+      </w:r>
+      <w:proofErr w:type="spellStart"/>
+      <w:r>
+        <w:rPr>
+          <w:rFonts w:ascii="Arial" w:hAnsi="Arial" w:cs="Arial"/>
+          <w:i/>
+          <w:iCs/>
+          <w:sz w:val="22"/>
+          <w:szCs w:val="22"/>
+        </w:rPr>
+        <w:t>kasd</w:t>
+      </w:r>
+      <w:proofErr w:type="spellEnd"/>
+      <w:r>
+        <w:rPr>
+          <w:rFonts w:ascii="Arial" w:hAnsi="Arial" w:cs="Arial"/>
+          <w:i/>
+          <w:iCs/>
+          <w:sz w:val="22"/>
+          <w:szCs w:val="22"/>
+        </w:rPr>
+        <w:t xml:space="preserve"> </w:t>
+      </w:r>
+      <w:proofErr w:type="spellStart"/>
+      <w:r>
+        <w:rPr>
+          <w:rFonts w:ascii="Arial" w:hAnsi="Arial" w:cs="Arial"/>
+          <w:i/>
+          <w:iCs/>
+          <w:sz w:val="22"/>
+          <w:szCs w:val="22"/>
+        </w:rPr>
+        <w:t>gubergren</w:t>
+      </w:r>
+      <w:proofErr w:type="spellEnd"/>
+      <w:r>
+        <w:rPr>
+          <w:rFonts w:ascii="Arial" w:hAnsi="Arial" w:cs="Arial"/>
+          <w:i/>
+          <w:iCs/>
+          <w:sz w:val="22"/>
+          <w:szCs w:val="22"/>
+        </w:rPr>
+        <w:t xml:space="preserve">, </w:t>
+      </w:r>
+      <w:proofErr w:type="spellStart"/>
+      <w:r>
+        <w:rPr>
+          <w:rFonts w:ascii="Arial" w:hAnsi="Arial" w:cs="Arial"/>
+          <w:i/>
+          <w:iCs/>
+          <w:sz w:val="22"/>
+          <w:szCs w:val="22"/>
+        </w:rPr>
+        <w:t>no</w:t>
+      </w:r>
+      <w:proofErr w:type="spellEnd"/>
+      <w:r>
+        <w:rPr>
+          <w:rFonts w:ascii="Arial" w:hAnsi="Arial" w:cs="Arial"/>
+          <w:i/>
+          <w:iCs/>
+          <w:sz w:val="22"/>
+          <w:szCs w:val="22"/>
+        </w:rPr>
+        <w:t xml:space="preserve"> </w:t>
+      </w:r>
+      <w:proofErr w:type="spellStart"/>
+      <w:r>
+        <w:rPr>
+          <w:rFonts w:ascii="Arial" w:hAnsi="Arial" w:cs="Arial"/>
+          <w:i/>
+          <w:iCs/>
+          <w:sz w:val="22"/>
+          <w:szCs w:val="22"/>
+        </w:rPr>
+        <w:t>sea</w:t>
+      </w:r>
+      <w:proofErr w:type="spellEnd"/>
+      <w:r>
+        <w:rPr>
+          <w:rFonts w:ascii="Arial" w:hAnsi="Arial" w:cs="Arial"/>
+          <w:i/>
+          <w:iCs/>
+          <w:sz w:val="22"/>
+          <w:szCs w:val="22"/>
+        </w:rPr>
+        <w:t xml:space="preserve"> </w:t>
+      </w:r>
+      <w:proofErr w:type="spellStart"/>
+      <w:r>
+        <w:rPr>
+          <w:rFonts w:ascii="Arial" w:hAnsi="Arial" w:cs="Arial"/>
+          <w:i/>
+          <w:iCs/>
+          <w:sz w:val="22"/>
+          <w:szCs w:val="22"/>
+        </w:rPr>
+        <w:t>takimata</w:t>
+      </w:r>
+      <w:proofErr w:type="spellEnd"/>
+      <w:r>
+        <w:rPr>
+          <w:rFonts w:ascii="Arial" w:hAnsi="Arial" w:cs="Arial"/>
+          <w:i/>
+          <w:iCs/>
+          <w:sz w:val="22"/>
+          <w:szCs w:val="22"/>
+        </w:rPr>
+        <w:t xml:space="preserve"> sanctus </w:t>
+      </w:r>
+      <w:proofErr w:type="spellStart"/>
+      <w:r>
+        <w:rPr>
+          <w:rFonts w:ascii="Arial" w:hAnsi="Arial" w:cs="Arial"/>
+          <w:i/>
+          <w:iCs/>
+          <w:sz w:val="22"/>
+          <w:szCs w:val="22"/>
+        </w:rPr>
+        <w:t>est</w:t>
+      </w:r>
+      <w:proofErr w:type="spellEnd"/>
+      <w:r>
+        <w:rPr>
+          <w:rFonts w:ascii="Arial" w:hAnsi="Arial" w:cs="Arial"/>
+          <w:i/>
+          <w:iCs/>
+          <w:sz w:val="22"/>
+          <w:szCs w:val="22"/>
+        </w:rPr>
+        <w:t xml:space="preserve"> </w:t>
+      </w:r>
+      <w:proofErr w:type="spellStart"/>
+      <w:r>
+        <w:rPr>
+          <w:rFonts w:ascii="Arial" w:hAnsi="Arial" w:cs="Arial"/>
+          <w:i/>
+          <w:iCs/>
+          <w:sz w:val="22"/>
+          <w:szCs w:val="22"/>
+        </w:rPr>
+        <w:t>Lorem</w:t>
+      </w:r>
+      <w:proofErr w:type="spellEnd"/>
+      <w:r>
+        <w:rPr>
+          <w:rFonts w:ascii="Arial" w:hAnsi="Arial" w:cs="Arial"/>
+          <w:i/>
+          <w:iCs/>
+          <w:sz w:val="22"/>
+          <w:szCs w:val="22"/>
+        </w:rPr>
+        <w:t xml:space="preserve"> </w:t>
+      </w:r>
+      <w:proofErr w:type="spellStart"/>
+      <w:r>
+        <w:rPr>
+          <w:rFonts w:ascii="Arial" w:hAnsi="Arial" w:cs="Arial"/>
+          <w:i/>
+          <w:iCs/>
+          <w:sz w:val="22"/>
+          <w:szCs w:val="22"/>
+        </w:rPr>
+        <w:t>ipsum</w:t>
+      </w:r>
+      <w:proofErr w:type="spellEnd"/>
+      <w:r>
+        <w:rPr>
+          <w:rFonts w:ascii="Arial" w:hAnsi="Arial" w:cs="Arial"/>
+          <w:i/>
+          <w:iCs/>
+          <w:sz w:val="22"/>
+          <w:szCs w:val="22"/>
+        </w:rPr>
+        <w:t xml:space="preserve"> </w:t>
+      </w:r>
+      <w:proofErr w:type="spellStart"/>
+      <w:r>
+        <w:rPr>
+          <w:rFonts w:ascii="Arial" w:hAnsi="Arial" w:cs="Arial"/>
+          <w:i/>
+          <w:iCs/>
+          <w:sz w:val="22"/>
+          <w:szCs w:val="22"/>
+        </w:rPr>
+        <w:t>dolor</w:t>
+      </w:r>
+      <w:proofErr w:type="spellEnd"/>
+      <w:r>
+        <w:rPr>
+          <w:rFonts w:ascii="Arial" w:hAnsi="Arial" w:cs="Arial"/>
+          <w:i/>
+          <w:iCs/>
+          <w:sz w:val="22"/>
+          <w:szCs w:val="22"/>
+        </w:rPr>
+        <w:t xml:space="preserve"> </w:t>
+      </w:r>
+      <w:proofErr w:type="spellStart"/>
+      <w:r>
+        <w:rPr>
+          <w:rFonts w:ascii="Arial" w:hAnsi="Arial" w:cs="Arial"/>
+          <w:i/>
+          <w:iCs/>
+          <w:sz w:val="22"/>
+          <w:szCs w:val="22"/>
+        </w:rPr>
+        <w:t>sit</w:t>
+      </w:r>
+      <w:proofErr w:type="spellEnd"/>
+      <w:r>
+        <w:rPr>
+          <w:rFonts w:ascii="Arial" w:hAnsi="Arial" w:cs="Arial"/>
+          <w:i/>
+          <w:iCs/>
+          <w:sz w:val="22"/>
+          <w:szCs w:val="22"/>
+        </w:rPr>
+        <w:t xml:space="preserve"> </w:t>
+      </w:r>
+      <w:proofErr w:type="spellStart"/>
+      <w:r>
+        <w:rPr>
+          <w:rFonts w:ascii="Arial" w:hAnsi="Arial" w:cs="Arial"/>
+          <w:i/>
+          <w:iCs/>
+          <w:sz w:val="22"/>
+          <w:szCs w:val="22"/>
+        </w:rPr>
+        <w:t>amet</w:t>
+      </w:r>
+      <w:proofErr w:type="spellEnd"/>
+      <w:r>
+        <w:rPr>
+          <w:rFonts w:ascii="Arial" w:hAnsi="Arial" w:cs="Arial"/>
+          <w:i/>
+          <w:iCs/>
+          <w:sz w:val="22"/>
+          <w:szCs w:val="22"/>
+        </w:rPr>
+        <w:t>.</w:t>
       </w:r>
     </w:p>
     <w:p>
@@ -652,7 +5141,25 @@
           <w:sz w:val="22"/>
           <w:szCs w:val="22"/>
         </w:rPr>
-        <w:t>{%p endif %}</w:t>
+        <w:t xml:space="preserve">{%p </w:t>
+      </w:r>
+      <w:proofErr w:type="spellStart"/>
+      <w:r>
+        <w:rPr>
+          <w:rFonts w:ascii="Arial" w:hAnsi="Arial" w:cs="Arial"/>
+          <w:sz w:val="22"/>
+          <w:szCs w:val="22"/>
+        </w:rPr>
+        <w:t>endif</w:t>
+      </w:r>
+      <w:proofErr w:type="spellEnd"/>
+      <w:r>
+        <w:rPr>
+          <w:rFonts w:ascii="Arial" w:hAnsi="Arial" w:cs="Arial"/>
+          <w:sz w:val="22"/>
+          <w:szCs w:val="22"/>
+        </w:rPr>
+        <w:t xml:space="preserve"> %}</w:t>
       </w:r>
     </w:p>
     <w:sectPr>
@@ -838,7 +5345,35 @@
       <w:rPr>
         <w:rFonts w:ascii="Arial" w:hAnsi="Arial" w:cs="Arial"/>
       </w:rPr>
-      <w:t>{{p contact_legal_block }}</w:t>
+      <w:t xml:space="preserve">{{p </w:t>
+    </w:r>
+    <w:proofErr w:type="spellStart"/>
+    <w:r>
+      <w:rPr>
+        <w:rFonts w:ascii="Arial" w:hAnsi="Arial" w:cs="Arial"/>
+      </w:rPr>
+      <w:t>contact_legal_</w:t>
+    </w:r>
+    <w:proofErr w:type="gramStart"/>
+    <w:r>
+      <w:rPr>
+        <w:rFonts w:ascii="Arial" w:hAnsi="Arial" w:cs="Arial"/>
+      </w:rPr>
+      <w:t>block</w:t>
+    </w:r>
+    <w:proofErr w:type="spellEnd"/>
+    <w:r>
+      <w:rPr>
+        <w:rFonts w:ascii="Arial" w:hAnsi="Arial" w:cs="Arial"/>
+      </w:rPr>
+      <w:t xml:space="preserve"> }</w:t>
+    </w:r>
+    <w:proofErr w:type="gramEnd"/>
+    <w:r>
+      <w:rPr>
+        <w:rFonts w:ascii="Arial" w:hAnsi="Arial" w:cs="Arial"/>
+      </w:rPr>
+      <w:t>}</w:t>
     </w:r>
   </w:p>
 </w:ftr>
@@ -928,7 +5463,35 @@
       <w:rPr>
         <w:rFonts w:ascii="Arial" w:hAnsi="Arial" w:cs="Arial"/>
       </w:rPr>
-      <w:t>{{p contact_legal_block }}</w:t>
+      <w:t xml:space="preserve">{{p </w:t>
+    </w:r>
+    <w:proofErr w:type="spellStart"/>
+    <w:r>
+      <w:rPr>
+        <w:rFonts w:ascii="Arial" w:hAnsi="Arial" w:cs="Arial"/>
+      </w:rPr>
+      <w:t>contact_legal_</w:t>
+    </w:r>
+    <w:proofErr w:type="gramStart"/>
+    <w:r>
+      <w:rPr>
+        <w:rFonts w:ascii="Arial" w:hAnsi="Arial" w:cs="Arial"/>
+      </w:rPr>
+      <w:t>block</w:t>
+    </w:r>
+    <w:proofErr w:type="spellEnd"/>
+    <w:r>
+      <w:rPr>
+        <w:rFonts w:ascii="Arial" w:hAnsi="Arial" w:cs="Arial"/>
+      </w:rPr>
+      <w:t xml:space="preserve"> }</w:t>
+    </w:r>
+    <w:proofErr w:type="gramEnd"/>
+    <w:r>
+      <w:rPr>
+        <w:rFonts w:ascii="Arial" w:hAnsi="Arial" w:cs="Arial"/>
+      </w:rPr>
+      <w:t>}</w:t>
     </w:r>
   </w:p>
 </w:ftr>

</xml_diff>

<commit_message>
Generate mailmerge PDFs from the Django admin
</commit_message>
<xml_diff>
--- a/events/document_templates/participant_list.docx
+++ b/events/document_templates/participant_list.docx
@@ -1078,6 +1078,23 @@
           <w:color w:val="EE0000"/>
         </w:rPr>
         <w:fldChar w:fldCharType="end"/>
+      </w:r>
+    </w:p>
+    <w:p>
+      <w:pPr>
+        <w:rPr>
+          <w:rFonts w:ascii="Arial" w:hAnsi="Arial" w:cs="Arial"/>
+          <w:sz w:val="22"/>
+          <w:szCs w:val="22"/>
+        </w:rPr>
+      </w:pPr>
+      <w:r>
+        <w:rPr>
+          <w:rFonts w:ascii="Arial" w:hAnsi="Arial" w:cs="Arial"/>
+          <w:sz w:val="22"/>
+          <w:szCs w:val="22"/>
+        </w:rPr>
+        <w:br w:type="page"/>
       </w:r>
     </w:p>
     <w:p>
@@ -1259,49 +1276,6 @@
         <w:rFonts w:ascii="Arial" w:hAnsi="Arial" w:cs="Arial"/>
       </w:rPr>
     </w:pPr>
-  </w:p>
-  <w:p>
-    <w:pPr>
-      <w:pStyle w:val="Fuzeile"/>
-      <w:ind w:right="360"/>
-      <w:rPr>
-        <w:rFonts w:ascii="Arial" w:hAnsi="Arial" w:cs="Arial"/>
-      </w:rPr>
-    </w:pPr>
-    <w:r>
-      <w:rPr>
-        <w:rFonts w:ascii="Arial" w:hAnsi="Arial" w:cs="Arial"/>
-      </w:rPr>
-      <w:t xml:space="preserve">{{p </w:t>
-    </w:r>
-    <w:proofErr w:type="spellStart"/>
-    <w:r>
-      <w:rPr>
-        <w:rFonts w:ascii="Arial" w:hAnsi="Arial" w:cs="Arial"/>
-      </w:rPr>
-      <w:t>contact_legal_</w:t>
-    </w:r>
-    <w:proofErr w:type="gramStart"/>
-    <w:r>
-      <w:rPr>
-        <w:rFonts w:ascii="Arial" w:hAnsi="Arial" w:cs="Arial"/>
-      </w:rPr>
-      <w:t>block</w:t>
-    </w:r>
-    <w:proofErr w:type="spellEnd"/>
-    <w:r>
-      <w:rPr>
-        <w:rFonts w:ascii="Arial" w:hAnsi="Arial" w:cs="Arial"/>
-      </w:rPr>
-      <w:t xml:space="preserve"> }</w:t>
-    </w:r>
-    <w:proofErr w:type="gramEnd"/>
-    <w:r>
-      <w:rPr>
-        <w:rFonts w:ascii="Arial" w:hAnsi="Arial" w:cs="Arial"/>
-      </w:rPr>
-      <w:t>}</w:t>
-    </w:r>
   </w:p>
 </w:ftr>
 </file>

</xml_diff>